<commit_message>
Updated Scrum Meeting Files
</commit_message>
<xml_diff>
--- a/Scrum Meeting Dump/Scrum Meeting Minutes.docx
+++ b/Scrum Meeting Dump/Scrum Meeting Minutes.docx
@@ -195,6 +195,97 @@
       </w:pPr>
       <w:r>
         <w:t>Idea of project after first week of development</w:t>
+      </w:r>
+    </w:p>
+    <w:p/>
+    <w:p>
+      <w:pPr>
+        <w:rPr>
+          <w:b/>
+          <w:bCs/>
+          <w:u w:val="single"/>
+        </w:rPr>
+      </w:pPr>
+      <w:r>
+        <w:rPr>
+          <w:b/>
+          <w:bCs/>
+          <w:u w:val="single"/>
+        </w:rPr>
+        <w:t>27/01</w:t>
+      </w:r>
+      <w:r>
+        <w:rPr>
+          <w:b/>
+          <w:bCs/>
+          <w:u w:val="single"/>
+        </w:rPr>
+        <w:t>/2026</w:t>
+      </w:r>
+    </w:p>
+    <w:p>
+      <w:r>
+        <w:t>14:35 – 16:25</w:t>
+      </w:r>
+      <w:r>
+        <w:t xml:space="preserve"> (110 minutes)</w:t>
+      </w:r>
+    </w:p>
+    <w:p>
+      <w:pPr>
+        <w:pStyle w:val="ListParagraph"/>
+        <w:numPr>
+          <w:ilvl w:val="0"/>
+          <w:numId w:val="3"/>
+        </w:numPr>
+      </w:pPr>
+      <w:r>
+        <w:t>Reflection of 1</w:t>
+      </w:r>
+      <w:r>
+        <w:rPr>
+          <w:vertAlign w:val="superscript"/>
+        </w:rPr>
+        <w:t>st</w:t>
+      </w:r>
+      <w:r>
+        <w:t xml:space="preserve"> Scrum</w:t>
+      </w:r>
+    </w:p>
+    <w:p>
+      <w:pPr>
+        <w:pStyle w:val="ListParagraph"/>
+        <w:numPr>
+          <w:ilvl w:val="0"/>
+          <w:numId w:val="3"/>
+        </w:numPr>
+      </w:pPr>
+      <w:r>
+        <w:t>Ideas of what to do next</w:t>
+      </w:r>
+    </w:p>
+    <w:p>
+      <w:pPr>
+        <w:pStyle w:val="ListParagraph"/>
+        <w:numPr>
+          <w:ilvl w:val="0"/>
+          <w:numId w:val="3"/>
+        </w:numPr>
+      </w:pPr>
+      <w:r>
+        <w:t>Made a lo-fi prototype</w:t>
+      </w:r>
+    </w:p>
+    <w:p>
+      <w:pPr>
+        <w:pStyle w:val="ListParagraph"/>
+        <w:numPr>
+          <w:ilvl w:val="0"/>
+          <w:numId w:val="3"/>
+        </w:numPr>
+      </w:pPr>
+      <w:r>
+        <w:t>Plans for next scrum</w:t>
       </w:r>
     </w:p>
     <w:sectPr>
@@ -323,6 +414,119 @@
     </w:lvl>
   </w:abstractNum>
   <w:abstractNum w:abstractNumId="1" w15:restartNumberingAfterBreak="0">
+    <w:nsid w:val="4A32146F"/>
+    <w:multiLevelType w:val="hybridMultilevel"/>
+    <w:tmpl w:val="11E61ACE"/>
+    <w:lvl w:ilvl="0" w:tplc="08090001">
+      <w:start w:val="1"/>
+      <w:numFmt w:val="bullet"/>
+      <w:lvlText w:val=""/>
+      <w:lvlJc w:val="left"/>
+      <w:pPr>
+        <w:ind w:left="720" w:hanging="360"/>
+      </w:pPr>
+      <w:rPr>
+        <w:rFonts w:ascii="Symbol" w:hAnsi="Symbol" w:hint="default"/>
+      </w:rPr>
+    </w:lvl>
+    <w:lvl w:ilvl="1" w:tplc="08090003" w:tentative="1">
+      <w:start w:val="1"/>
+      <w:numFmt w:val="bullet"/>
+      <w:lvlText w:val="o"/>
+      <w:lvlJc w:val="left"/>
+      <w:pPr>
+        <w:ind w:left="1440" w:hanging="360"/>
+      </w:pPr>
+      <w:rPr>
+        <w:rFonts w:ascii="Courier New" w:hAnsi="Courier New" w:cs="Courier New" w:hint="default"/>
+      </w:rPr>
+    </w:lvl>
+    <w:lvl w:ilvl="2" w:tplc="08090005" w:tentative="1">
+      <w:start w:val="1"/>
+      <w:numFmt w:val="bullet"/>
+      <w:lvlText w:val=""/>
+      <w:lvlJc w:val="left"/>
+      <w:pPr>
+        <w:ind w:left="2160" w:hanging="360"/>
+      </w:pPr>
+      <w:rPr>
+        <w:rFonts w:ascii="Wingdings" w:hAnsi="Wingdings" w:hint="default"/>
+      </w:rPr>
+    </w:lvl>
+    <w:lvl w:ilvl="3" w:tplc="08090001" w:tentative="1">
+      <w:start w:val="1"/>
+      <w:numFmt w:val="bullet"/>
+      <w:lvlText w:val=""/>
+      <w:lvlJc w:val="left"/>
+      <w:pPr>
+        <w:ind w:left="2880" w:hanging="360"/>
+      </w:pPr>
+      <w:rPr>
+        <w:rFonts w:ascii="Symbol" w:hAnsi="Symbol" w:hint="default"/>
+      </w:rPr>
+    </w:lvl>
+    <w:lvl w:ilvl="4" w:tplc="08090003" w:tentative="1">
+      <w:start w:val="1"/>
+      <w:numFmt w:val="bullet"/>
+      <w:lvlText w:val="o"/>
+      <w:lvlJc w:val="left"/>
+      <w:pPr>
+        <w:ind w:left="3600" w:hanging="360"/>
+      </w:pPr>
+      <w:rPr>
+        <w:rFonts w:ascii="Courier New" w:hAnsi="Courier New" w:cs="Courier New" w:hint="default"/>
+      </w:rPr>
+    </w:lvl>
+    <w:lvl w:ilvl="5" w:tplc="08090005" w:tentative="1">
+      <w:start w:val="1"/>
+      <w:numFmt w:val="bullet"/>
+      <w:lvlText w:val=""/>
+      <w:lvlJc w:val="left"/>
+      <w:pPr>
+        <w:ind w:left="4320" w:hanging="360"/>
+      </w:pPr>
+      <w:rPr>
+        <w:rFonts w:ascii="Wingdings" w:hAnsi="Wingdings" w:hint="default"/>
+      </w:rPr>
+    </w:lvl>
+    <w:lvl w:ilvl="6" w:tplc="08090001" w:tentative="1">
+      <w:start w:val="1"/>
+      <w:numFmt w:val="bullet"/>
+      <w:lvlText w:val=""/>
+      <w:lvlJc w:val="left"/>
+      <w:pPr>
+        <w:ind w:left="5040" w:hanging="360"/>
+      </w:pPr>
+      <w:rPr>
+        <w:rFonts w:ascii="Symbol" w:hAnsi="Symbol" w:hint="default"/>
+      </w:rPr>
+    </w:lvl>
+    <w:lvl w:ilvl="7" w:tplc="08090003" w:tentative="1">
+      <w:start w:val="1"/>
+      <w:numFmt w:val="bullet"/>
+      <w:lvlText w:val="o"/>
+      <w:lvlJc w:val="left"/>
+      <w:pPr>
+        <w:ind w:left="5760" w:hanging="360"/>
+      </w:pPr>
+      <w:rPr>
+        <w:rFonts w:ascii="Courier New" w:hAnsi="Courier New" w:cs="Courier New" w:hint="default"/>
+      </w:rPr>
+    </w:lvl>
+    <w:lvl w:ilvl="8" w:tplc="08090005" w:tentative="1">
+      <w:start w:val="1"/>
+      <w:numFmt w:val="bullet"/>
+      <w:lvlText w:val=""/>
+      <w:lvlJc w:val="left"/>
+      <w:pPr>
+        <w:ind w:left="6480" w:hanging="360"/>
+      </w:pPr>
+      <w:rPr>
+        <w:rFonts w:ascii="Wingdings" w:hAnsi="Wingdings" w:hint="default"/>
+      </w:rPr>
+    </w:lvl>
+  </w:abstractNum>
+  <w:abstractNum w:abstractNumId="2" w15:restartNumberingAfterBreak="0">
     <w:nsid w:val="555C603E"/>
     <w:multiLevelType w:val="hybridMultilevel"/>
     <w:tmpl w:val="C9565F02"/>
@@ -436,10 +640,13 @@
     </w:lvl>
   </w:abstractNum>
   <w:num w:numId="1" w16cid:durableId="1406219813">
-    <w:abstractNumId w:val="1"/>
+    <w:abstractNumId w:val="2"/>
   </w:num>
   <w:num w:numId="2" w16cid:durableId="987442492">
     <w:abstractNumId w:val="0"/>
+  </w:num>
+  <w:num w:numId="3" w16cid:durableId="1090585040">
+    <w:abstractNumId w:val="1"/>
   </w:num>
 </w:numbering>
 </file>
@@ -1361,6 +1568,24 @@
       <w:spacing w:val="5"/>
     </w:rPr>
   </w:style>
+  <w:style w:type="paragraph" w:styleId="Date">
+    <w:name w:val="Date"/>
+    <w:basedOn w:val="Normal"/>
+    <w:next w:val="Normal"/>
+    <w:link w:val="DateChar"/>
+    <w:uiPriority w:val="99"/>
+    <w:semiHidden/>
+    <w:unhideWhenUsed/>
+    <w:rsid w:val="00253ABE"/>
+  </w:style>
+  <w:style w:type="character" w:customStyle="1" w:styleId="DateChar">
+    <w:name w:val="Date Char"/>
+    <w:basedOn w:val="DefaultParagraphFont"/>
+    <w:link w:val="Date"/>
+    <w:uiPriority w:val="99"/>
+    <w:semiHidden/>
+    <w:rsid w:val="00253ABE"/>
+  </w:style>
 </w:styles>
 </file>
 
@@ -1660,6 +1885,15 @@
 </file>
 
 <file path=customXml/item1.xml><?xml version="1.0" encoding="utf-8"?>
+<?mso-contentType ?>
+<FormTemplates xmlns="http://schemas.microsoft.com/sharepoint/v3/contenttype/forms">
+  <Display>DocumentLibraryForm</Display>
+  <Edit>DocumentLibraryForm</Edit>
+  <New>DocumentLibraryForm</New>
+</FormTemplates>
+</file>
+
+<file path=customXml/item2.xml><?xml version="1.0" encoding="utf-8"?>
 <ct:contentTypeSchema xmlns:ct="http://schemas.microsoft.com/office/2006/metadata/contentType" xmlns:ma="http://schemas.microsoft.com/office/2006/metadata/properties/metaAttributes" ct:_="" ma:_="" ma:contentTypeName="Document" ma:contentTypeID="0x0101001BE5375FF31C3E40A471EB786507D009" ma:contentTypeVersion="11" ma:contentTypeDescription="Create a new document." ma:contentTypeScope="" ma:versionID="42a79d177e073060118b3f26c9f45197">
   <xsd:schema xmlns:xsd="http://www.w3.org/2001/XMLSchema" xmlns:xs="http://www.w3.org/2001/XMLSchema" xmlns:p="http://schemas.microsoft.com/office/2006/metadata/properties" xmlns:ns3="7cd080e9-c5cf-4d99-bc08-2a3e85ed19f2" targetNamespace="http://schemas.microsoft.com/office/2006/metadata/properties" ma:root="true" ma:fieldsID="49e7f8ba73eb6f244726330dfda763a1" ns3:_="">
     <xsd:import namespace="7cd080e9-c5cf-4d99-bc08-2a3e85ed19f2"/>
@@ -1847,15 +2081,6 @@
 </ct:contentTypeSchema>
 </file>
 
-<file path=customXml/item2.xml><?xml version="1.0" encoding="utf-8"?>
-<?mso-contentType ?>
-<FormTemplates xmlns="http://schemas.microsoft.com/sharepoint/v3/contenttype/forms">
-  <Display>DocumentLibraryForm</Display>
-  <Edit>DocumentLibraryForm</Edit>
-  <New>DocumentLibraryForm</New>
-</FormTemplates>
-</file>
-
 <file path=customXml/item3.xml><?xml version="1.0" encoding="utf-8"?>
 <p:properties xmlns:p="http://schemas.microsoft.com/office/2006/metadata/properties" xmlns:xsi="http://www.w3.org/2001/XMLSchema-instance" xmlns:pc="http://schemas.microsoft.com/office/infopath/2007/PartnerControls">
   <documentManagement>
@@ -1865,6 +2090,14 @@
 </file>
 
 <file path=customXml/itemProps1.xml><?xml version="1.0" encoding="utf-8"?>
+<ds:datastoreItem xmlns:ds="http://schemas.openxmlformats.org/officeDocument/2006/customXml" ds:itemID="{73F29C20-B9D5-4F52-96A6-94B9FF10F71E}">
+  <ds:schemaRefs>
+    <ds:schemaRef ds:uri="http://schemas.microsoft.com/sharepoint/v3/contenttype/forms"/>
+  </ds:schemaRefs>
+</ds:datastoreItem>
+</file>
+
+<file path=customXml/itemProps2.xml><?xml version="1.0" encoding="utf-8"?>
 <ds:datastoreItem xmlns:ds="http://schemas.openxmlformats.org/officeDocument/2006/customXml" ds:itemID="{2D2F8EE4-5CF8-45C8-B30E-433364BE7004}">
   <ds:schemaRefs>
     <ds:schemaRef ds:uri="http://schemas.microsoft.com/office/2006/metadata/contentType"/>
@@ -1878,14 +2111,6 @@
     <ds:schemaRef ds:uri="http://purl.org/dc/elements/1.1/"/>
     <ds:schemaRef ds:uri="http://purl.org/dc/terms/"/>
     <ds:schemaRef ds:uri="http://schemas.microsoft.com/internal/obd"/>
-  </ds:schemaRefs>
-</ds:datastoreItem>
-</file>
-
-<file path=customXml/itemProps2.xml><?xml version="1.0" encoding="utf-8"?>
-<ds:datastoreItem xmlns:ds="http://schemas.openxmlformats.org/officeDocument/2006/customXml" ds:itemID="{73F29C20-B9D5-4F52-96A6-94B9FF10F71E}">
-  <ds:schemaRefs>
-    <ds:schemaRef ds:uri="http://schemas.microsoft.com/sharepoint/v3/contenttype/forms"/>
   </ds:schemaRefs>
 </ds:datastoreItem>
 </file>

</xml_diff>

<commit_message>
Updates Scrum Meeting Minutes
</commit_message>
<xml_diff>
--- a/Scrum Meeting Dump/Scrum Meeting Minutes.docx
+++ b/Scrum Meeting Dump/Scrum Meeting Minutes.docx
@@ -19,17 +19,28 @@
           <w:sz w:val="40"/>
           <w:szCs w:val="40"/>
         </w:rPr>
-        <w:t>Scrum Meeting Minutes for Java_The_Hutt</w:t>
-      </w:r>
-    </w:p>
-    <w:p>
-      <w:pPr>
+        <w:t xml:space="preserve">Meeting Minutes for </w:t>
+      </w:r>
+      <w:proofErr w:type="spellStart"/>
+      <w:r>
         <w:rPr>
           <w:b/>
           <w:bCs/>
           <w:sz w:val="40"/>
           <w:szCs w:val="40"/>
         </w:rPr>
+        <w:t>Java_The_Hutt</w:t>
+      </w:r>
+      <w:proofErr w:type="spellEnd"/>
+    </w:p>
+    <w:p>
+      <w:pPr>
+        <w:rPr>
+          <w:b/>
+          <w:bCs/>
+          <w:sz w:val="40"/>
+          <w:szCs w:val="40"/>
+        </w:rPr>
       </w:pPr>
     </w:p>
     <w:p>
@@ -48,6 +59,14 @@
         </w:rPr>
         <w:t>13/01/2026</w:t>
       </w:r>
+      <w:r>
+        <w:rPr>
+          <w:b/>
+          <w:bCs/>
+          <w:u w:val="single"/>
+        </w:rPr>
+        <w:t xml:space="preserve"> WSL</w:t>
+      </w:r>
     </w:p>
     <w:p>
       <w:r>
@@ -55,6 +74,197 @@
       </w:r>
     </w:p>
     <w:p>
+      <w:r>
+        <w:t xml:space="preserve">A weekly laboratory to discuss </w:t>
+      </w:r>
+      <w:r>
+        <w:t xml:space="preserve">what project we are going to make and the </w:t>
+      </w:r>
+      <w:proofErr w:type="spellStart"/>
+      <w:r>
+        <w:t>MoSCoW</w:t>
+      </w:r>
+      <w:proofErr w:type="spellEnd"/>
+      <w:r>
+        <w:t xml:space="preserve"> for each user story</w:t>
+      </w:r>
+    </w:p>
+    <w:p>
+      <w:r>
+        <w:t>Members Present</w:t>
+      </w:r>
+      <w:r>
+        <w:t xml:space="preserve"> and Roles Given</w:t>
+      </w:r>
+      <w:r>
+        <w:t>:</w:t>
+      </w:r>
+    </w:p>
+    <w:p>
+      <w:pPr>
+        <w:pStyle w:val="ListParagraph"/>
+        <w:numPr>
+          <w:ilvl w:val="0"/>
+          <w:numId w:val="8"/>
+        </w:numPr>
+      </w:pPr>
+      <w:r>
+        <w:t>Chase Sibley</w:t>
+      </w:r>
+      <w:r>
+        <w:t xml:space="preserve"> </w:t>
+      </w:r>
+      <w:r>
+        <w:t>-</w:t>
+      </w:r>
+      <w:r>
+        <w:t xml:space="preserve"> Vice Scrum Master</w:t>
+      </w:r>
+      <w:r>
+        <w:t xml:space="preserve"> </w:t>
+      </w:r>
+      <w:r>
+        <w:t>and</w:t>
+      </w:r>
+      <w:r>
+        <w:t xml:space="preserve"> Testing</w:t>
+      </w:r>
+    </w:p>
+    <w:p>
+      <w:pPr>
+        <w:pStyle w:val="ListParagraph"/>
+        <w:numPr>
+          <w:ilvl w:val="0"/>
+          <w:numId w:val="8"/>
+        </w:numPr>
+      </w:pPr>
+      <w:r>
+        <w:t>Alistar Bishop</w:t>
+      </w:r>
+      <w:r>
+        <w:t xml:space="preserve"> </w:t>
+      </w:r>
+      <w:r>
+        <w:t>-</w:t>
+      </w:r>
+      <w:r>
+        <w:t xml:space="preserve"> Backend Developer</w:t>
+      </w:r>
+    </w:p>
+    <w:p>
+      <w:pPr>
+        <w:pStyle w:val="ListParagraph"/>
+        <w:numPr>
+          <w:ilvl w:val="0"/>
+          <w:numId w:val="8"/>
+        </w:numPr>
+      </w:pPr>
+      <w:r>
+        <w:t>Sam Taylor-King</w:t>
+      </w:r>
+      <w:r>
+        <w:t xml:space="preserve"> </w:t>
+      </w:r>
+      <w:r>
+        <w:t>-</w:t>
+      </w:r>
+      <w:r>
+        <w:t xml:space="preserve"> </w:t>
+      </w:r>
+      <w:r>
+        <w:t>Data Gathering and Implementation</w:t>
+      </w:r>
+    </w:p>
+    <w:p>
+      <w:pPr>
+        <w:pStyle w:val="ListParagraph"/>
+        <w:numPr>
+          <w:ilvl w:val="0"/>
+          <w:numId w:val="8"/>
+        </w:numPr>
+      </w:pPr>
+      <w:r>
+        <w:t>Oliver Methold</w:t>
+      </w:r>
+      <w:r>
+        <w:t xml:space="preserve"> </w:t>
+      </w:r>
+      <w:r>
+        <w:t xml:space="preserve">- </w:t>
+      </w:r>
+      <w:r>
+        <w:t>Scrum Master</w:t>
+      </w:r>
+      <w:r>
+        <w:t>,</w:t>
+      </w:r>
+      <w:r>
+        <w:t xml:space="preserve"> Project Owner</w:t>
+      </w:r>
+      <w:r>
+        <w:t xml:space="preserve"> and Project Overview</w:t>
+      </w:r>
+    </w:p>
+    <w:p>
+      <w:pPr>
+        <w:pStyle w:val="ListParagraph"/>
+        <w:numPr>
+          <w:ilvl w:val="0"/>
+          <w:numId w:val="8"/>
+        </w:numPr>
+      </w:pPr>
+      <w:r>
+        <w:t>Ted Turner</w:t>
+      </w:r>
+      <w:r>
+        <w:t xml:space="preserve"> - UI and Design</w:t>
+      </w:r>
+    </w:p>
+    <w:p>
+      <w:pPr>
+        <w:pStyle w:val="ListParagraph"/>
+        <w:numPr>
+          <w:ilvl w:val="0"/>
+          <w:numId w:val="8"/>
+        </w:numPr>
+      </w:pPr>
+      <w:r>
+        <w:t>Oliver Edwards</w:t>
+      </w:r>
+      <w:r>
+        <w:t xml:space="preserve"> - Documentation</w:t>
+      </w:r>
+    </w:p>
+    <w:p>
+      <w:pPr>
+        <w:pStyle w:val="ListParagraph"/>
+        <w:numPr>
+          <w:ilvl w:val="0"/>
+          <w:numId w:val="8"/>
+        </w:numPr>
+      </w:pPr>
+      <w:r>
+        <w:t>Ed Bickley</w:t>
+      </w:r>
+      <w:r>
+        <w:t xml:space="preserve"> </w:t>
+      </w:r>
+      <w:r>
+        <w:t>–</w:t>
+      </w:r>
+      <w:r>
+        <w:t xml:space="preserve"> </w:t>
+      </w:r>
+      <w:r>
+        <w:t>Software Engineer</w:t>
+      </w:r>
+    </w:p>
+    <w:p>
+      <w:r>
+        <w:t>Key Points:</w:t>
+      </w:r>
+    </w:p>
+    <w:p>
       <w:pPr>
         <w:pStyle w:val="ListParagraph"/>
         <w:numPr>
@@ -74,8 +284,13 @@
           <w:numId w:val="1"/>
         </w:numPr>
       </w:pPr>
-      <w:r>
-        <w:t>MoSCoW for project</w:t>
+      <w:proofErr w:type="spellStart"/>
+      <w:r>
+        <w:t>MoSCoW</w:t>
+      </w:r>
+      <w:proofErr w:type="spellEnd"/>
+      <w:r>
+        <w:t xml:space="preserve"> for project</w:t>
       </w:r>
     </w:p>
     <w:p>
@@ -100,6 +315,74 @@
       </w:pPr>
       <w:r>
         <w:t>Group roles</w:t>
+      </w:r>
+    </w:p>
+    <w:p>
+      <w:r>
+        <w:t>Approved Motions:</w:t>
+      </w:r>
+    </w:p>
+    <w:p>
+      <w:pPr>
+        <w:pStyle w:val="ListParagraph"/>
+        <w:numPr>
+          <w:ilvl w:val="0"/>
+          <w:numId w:val="9"/>
+        </w:numPr>
+      </w:pPr>
+      <w:r>
+        <w:t>Find a useful framework for a website</w:t>
+      </w:r>
+      <w:r>
+        <w:t xml:space="preserve"> (Django?)</w:t>
+      </w:r>
+    </w:p>
+    <w:p>
+      <w:pPr>
+        <w:pStyle w:val="ListParagraph"/>
+        <w:numPr>
+          <w:ilvl w:val="0"/>
+          <w:numId w:val="9"/>
+        </w:numPr>
+      </w:pPr>
+      <w:r>
+        <w:t>Start with the backend and making an exhibit page</w:t>
+      </w:r>
+    </w:p>
+    <w:p>
+      <w:pPr>
+        <w:pStyle w:val="ListParagraph"/>
+        <w:numPr>
+          <w:ilvl w:val="0"/>
+          <w:numId w:val="9"/>
+        </w:numPr>
+      </w:pPr>
+      <w:r>
+        <w:t>Research about 5-10 cases to be added to the website</w:t>
+      </w:r>
+    </w:p>
+    <w:p>
+      <w:pPr>
+        <w:pStyle w:val="ListParagraph"/>
+        <w:numPr>
+          <w:ilvl w:val="0"/>
+          <w:numId w:val="9"/>
+        </w:numPr>
+      </w:pPr>
+      <w:r>
+        <w:t xml:space="preserve">Have a very basic UI </w:t>
+      </w:r>
+    </w:p>
+    <w:p>
+      <w:pPr>
+        <w:pStyle w:val="ListParagraph"/>
+        <w:numPr>
+          <w:ilvl w:val="0"/>
+          <w:numId w:val="9"/>
+        </w:numPr>
+      </w:pPr>
+      <w:r>
+        <w:t>Write tests for quizzes</w:t>
       </w:r>
     </w:p>
     <w:p/>
@@ -112,14 +395,86 @@
           <w:u w:val="single"/>
         </w:rPr>
       </w:pPr>
-      <w:r>
-        <w:rPr>
-          <w:b/>
-          <w:bCs/>
-          <w:u w:val="single"/>
-        </w:rPr>
+    </w:p>
+    <w:p>
+      <w:pPr>
+        <w:rPr>
+          <w:b/>
+          <w:bCs/>
+          <w:u w:val="single"/>
+        </w:rPr>
+      </w:pPr>
+    </w:p>
+    <w:p>
+      <w:pPr>
+        <w:rPr>
+          <w:b/>
+          <w:bCs/>
+          <w:u w:val="single"/>
+        </w:rPr>
+      </w:pPr>
+    </w:p>
+    <w:p>
+      <w:pPr>
+        <w:rPr>
+          <w:b/>
+          <w:bCs/>
+          <w:u w:val="single"/>
+        </w:rPr>
+      </w:pPr>
+    </w:p>
+    <w:p>
+      <w:pPr>
+        <w:rPr>
+          <w:b/>
+          <w:bCs/>
+          <w:u w:val="single"/>
+        </w:rPr>
+      </w:pPr>
+    </w:p>
+    <w:p>
+      <w:pPr>
+        <w:rPr>
+          <w:b/>
+          <w:bCs/>
+          <w:u w:val="single"/>
+        </w:rPr>
+      </w:pPr>
+    </w:p>
+    <w:p>
+      <w:pPr>
+        <w:rPr>
+          <w:b/>
+          <w:bCs/>
+          <w:u w:val="single"/>
+        </w:rPr>
+      </w:pPr>
+    </w:p>
+    <w:p>
+      <w:pPr>
+        <w:rPr>
+          <w:b/>
+          <w:bCs/>
+          <w:u w:val="single"/>
+        </w:rPr>
+      </w:pPr>
+      <w:r>
+        <w:rPr>
+          <w:b/>
+          <w:bCs/>
+          <w:u w:val="single"/>
+        </w:rPr>
+        <w:lastRenderedPageBreak/>
         <w:t>20/01/2026</w:t>
       </w:r>
+      <w:r>
+        <w:rPr>
+          <w:b/>
+          <w:bCs/>
+          <w:u w:val="single"/>
+        </w:rPr>
+        <w:t xml:space="preserve"> WSL</w:t>
+      </w:r>
     </w:p>
     <w:p>
       <w:r>
@@ -127,6 +482,111 @@
       </w:r>
     </w:p>
     <w:p>
+      <w:r>
+        <w:t>A weekly laboratory to discuss how to manage our tasks and our time, letting each member of the team aware of what needs to be done</w:t>
+      </w:r>
+    </w:p>
+    <w:p>
+      <w:r>
+        <w:t>Members Present:</w:t>
+      </w:r>
+    </w:p>
+    <w:p>
+      <w:pPr>
+        <w:pStyle w:val="ListParagraph"/>
+        <w:numPr>
+          <w:ilvl w:val="0"/>
+          <w:numId w:val="10"/>
+        </w:numPr>
+      </w:pPr>
+      <w:r>
+        <w:t>Chase Sibley</w:t>
+      </w:r>
+    </w:p>
+    <w:p>
+      <w:pPr>
+        <w:pStyle w:val="ListParagraph"/>
+        <w:numPr>
+          <w:ilvl w:val="0"/>
+          <w:numId w:val="10"/>
+        </w:numPr>
+      </w:pPr>
+      <w:r>
+        <w:t>Alistar Bishop</w:t>
+      </w:r>
+    </w:p>
+    <w:p>
+      <w:pPr>
+        <w:pStyle w:val="ListParagraph"/>
+        <w:numPr>
+          <w:ilvl w:val="0"/>
+          <w:numId w:val="10"/>
+        </w:numPr>
+      </w:pPr>
+      <w:r>
+        <w:t>Sam Taylor-King</w:t>
+      </w:r>
+    </w:p>
+    <w:p>
+      <w:pPr>
+        <w:pStyle w:val="ListParagraph"/>
+        <w:numPr>
+          <w:ilvl w:val="0"/>
+          <w:numId w:val="10"/>
+        </w:numPr>
+      </w:pPr>
+      <w:r>
+        <w:t>Ted Turner</w:t>
+      </w:r>
+    </w:p>
+    <w:p>
+      <w:pPr>
+        <w:pStyle w:val="ListParagraph"/>
+        <w:numPr>
+          <w:ilvl w:val="0"/>
+          <w:numId w:val="10"/>
+        </w:numPr>
+      </w:pPr>
+      <w:r>
+        <w:t>Ed Bick</w:t>
+      </w:r>
+      <w:r>
+        <w:t>le</w:t>
+      </w:r>
+      <w:r>
+        <w:t>y</w:t>
+      </w:r>
+    </w:p>
+    <w:p>
+      <w:pPr>
+        <w:pStyle w:val="ListParagraph"/>
+        <w:numPr>
+          <w:ilvl w:val="0"/>
+          <w:numId w:val="10"/>
+        </w:numPr>
+      </w:pPr>
+      <w:r>
+        <w:t>Oliver Methold</w:t>
+      </w:r>
+    </w:p>
+    <w:p>
+      <w:pPr>
+        <w:pStyle w:val="ListParagraph"/>
+        <w:numPr>
+          <w:ilvl w:val="0"/>
+          <w:numId w:val="10"/>
+        </w:numPr>
+      </w:pPr>
+      <w:r>
+        <w:t>Oliver Edwards</w:t>
+      </w:r>
+    </w:p>
+    <w:p>
+      <w:r>
+        <w:t>Key Points</w:t>
+      </w:r>
+    </w:p>
+    <w:p>
       <w:pPr>
         <w:pStyle w:val="ListParagraph"/>
         <w:numPr>
@@ -135,7 +595,15 @@
         </w:numPr>
       </w:pPr>
       <w:r>
-        <w:t>User stories and priority (with MoSCoW)</w:t>
+        <w:t xml:space="preserve">User stories and priority (with </w:t>
+      </w:r>
+      <w:proofErr w:type="spellStart"/>
+      <w:r>
+        <w:t>MoSCoW</w:t>
+      </w:r>
+      <w:proofErr w:type="spellEnd"/>
+      <w:r>
+        <w:t>)</w:t>
       </w:r>
     </w:p>
     <w:p>
@@ -186,6 +654,65 @@
         <w:t>Idea of project after first week of development</w:t>
       </w:r>
     </w:p>
+    <w:p>
+      <w:r>
+        <w:t>Approved Motions</w:t>
+      </w:r>
+      <w:r>
+        <w:t>:</w:t>
+      </w:r>
+    </w:p>
+    <w:p>
+      <w:pPr>
+        <w:pStyle w:val="ListParagraph"/>
+        <w:numPr>
+          <w:ilvl w:val="0"/>
+          <w:numId w:val="11"/>
+        </w:numPr>
+      </w:pPr>
+      <w:r>
+        <w:t>Have a better UI for the user</w:t>
+      </w:r>
+    </w:p>
+    <w:p>
+      <w:pPr>
+        <w:pStyle w:val="ListParagraph"/>
+        <w:numPr>
+          <w:ilvl w:val="0"/>
+          <w:numId w:val="11"/>
+        </w:numPr>
+      </w:pPr>
+      <w:r>
+        <w:t>Write tests for web server</w:t>
+      </w:r>
+    </w:p>
+    <w:p>
+      <w:pPr>
+        <w:pStyle w:val="ListParagraph"/>
+        <w:numPr>
+          <w:ilvl w:val="0"/>
+          <w:numId w:val="11"/>
+        </w:numPr>
+      </w:pPr>
+      <w:r>
+        <w:t>Start writing report and gather licensing</w:t>
+      </w:r>
+      <w:r>
+        <w:t xml:space="preserve"> etc.</w:t>
+      </w:r>
+    </w:p>
+    <w:p>
+      <w:pPr>
+        <w:pStyle w:val="ListParagraph"/>
+        <w:numPr>
+          <w:ilvl w:val="0"/>
+          <w:numId w:val="11"/>
+        </w:numPr>
+      </w:pPr>
+      <w:r>
+        <w:t>Risk assessment</w:t>
+      </w:r>
+    </w:p>
     <w:p/>
     <w:p>
       <w:pPr>
@@ -195,12 +722,112 @@
           <w:u w:val="single"/>
         </w:rPr>
       </w:pPr>
-      <w:r>
-        <w:rPr>
-          <w:b/>
-          <w:bCs/>
-          <w:u w:val="single"/>
-        </w:rPr>
+    </w:p>
+    <w:p>
+      <w:pPr>
+        <w:rPr>
+          <w:b/>
+          <w:bCs/>
+          <w:u w:val="single"/>
+        </w:rPr>
+      </w:pPr>
+    </w:p>
+    <w:p>
+      <w:pPr>
+        <w:rPr>
+          <w:b/>
+          <w:bCs/>
+          <w:u w:val="single"/>
+        </w:rPr>
+      </w:pPr>
+    </w:p>
+    <w:p>
+      <w:pPr>
+        <w:rPr>
+          <w:b/>
+          <w:bCs/>
+          <w:u w:val="single"/>
+        </w:rPr>
+      </w:pPr>
+    </w:p>
+    <w:p>
+      <w:pPr>
+        <w:rPr>
+          <w:b/>
+          <w:bCs/>
+          <w:u w:val="single"/>
+        </w:rPr>
+      </w:pPr>
+    </w:p>
+    <w:p>
+      <w:pPr>
+        <w:rPr>
+          <w:b/>
+          <w:bCs/>
+          <w:u w:val="single"/>
+        </w:rPr>
+      </w:pPr>
+    </w:p>
+    <w:p>
+      <w:pPr>
+        <w:rPr>
+          <w:b/>
+          <w:bCs/>
+          <w:u w:val="single"/>
+        </w:rPr>
+      </w:pPr>
+    </w:p>
+    <w:p>
+      <w:pPr>
+        <w:rPr>
+          <w:b/>
+          <w:bCs/>
+          <w:u w:val="single"/>
+        </w:rPr>
+      </w:pPr>
+    </w:p>
+    <w:p>
+      <w:pPr>
+        <w:rPr>
+          <w:b/>
+          <w:bCs/>
+          <w:u w:val="single"/>
+        </w:rPr>
+      </w:pPr>
+    </w:p>
+    <w:p>
+      <w:pPr>
+        <w:rPr>
+          <w:b/>
+          <w:bCs/>
+          <w:u w:val="single"/>
+        </w:rPr>
+      </w:pPr>
+    </w:p>
+    <w:p>
+      <w:pPr>
+        <w:rPr>
+          <w:b/>
+          <w:bCs/>
+          <w:u w:val="single"/>
+        </w:rPr>
+      </w:pPr>
+    </w:p>
+    <w:p>
+      <w:pPr>
+        <w:rPr>
+          <w:b/>
+          <w:bCs/>
+          <w:u w:val="single"/>
+        </w:rPr>
+      </w:pPr>
+      <w:r>
+        <w:rPr>
+          <w:b/>
+          <w:bCs/>
+          <w:u w:val="single"/>
+        </w:rPr>
+        <w:lastRenderedPageBreak/>
         <w:t>27/01</w:t>
       </w:r>
       <w:r>
@@ -211,6 +838,14 @@
         </w:rPr>
         <w:t>/2026</w:t>
       </w:r>
+      <w:r>
+        <w:rPr>
+          <w:b/>
+          <w:bCs/>
+          <w:u w:val="single"/>
+        </w:rPr>
+        <w:t xml:space="preserve"> WSL</w:t>
+      </w:r>
     </w:p>
     <w:p>
       <w:r>
@@ -221,6 +856,16 @@
       </w:r>
     </w:p>
     <w:p>
+      <w:r>
+        <w:t>A weekly laboratory with information on how to make a lo-fi prototype</w:t>
+      </w:r>
+    </w:p>
+    <w:p>
+      <w:r>
+        <w:t>Members Present:</w:t>
+      </w:r>
+    </w:p>
+    <w:p>
       <w:pPr>
         <w:pStyle w:val="ListParagraph"/>
         <w:numPr>
@@ -229,6 +874,101 @@
         </w:numPr>
       </w:pPr>
       <w:r>
+        <w:t>Chase Sibley</w:t>
+      </w:r>
+    </w:p>
+    <w:p>
+      <w:pPr>
+        <w:pStyle w:val="ListParagraph"/>
+        <w:numPr>
+          <w:ilvl w:val="0"/>
+          <w:numId w:val="3"/>
+        </w:numPr>
+      </w:pPr>
+      <w:r>
+        <w:t>Alistar Bishop</w:t>
+      </w:r>
+    </w:p>
+    <w:p>
+      <w:pPr>
+        <w:pStyle w:val="ListParagraph"/>
+        <w:numPr>
+          <w:ilvl w:val="0"/>
+          <w:numId w:val="3"/>
+        </w:numPr>
+      </w:pPr>
+      <w:r>
+        <w:t>Sam Taylor-King</w:t>
+      </w:r>
+    </w:p>
+    <w:p>
+      <w:pPr>
+        <w:pStyle w:val="ListParagraph"/>
+        <w:numPr>
+          <w:ilvl w:val="0"/>
+          <w:numId w:val="3"/>
+        </w:numPr>
+      </w:pPr>
+      <w:r>
+        <w:t>Ted Turner</w:t>
+      </w:r>
+    </w:p>
+    <w:p>
+      <w:pPr>
+        <w:pStyle w:val="ListParagraph"/>
+        <w:numPr>
+          <w:ilvl w:val="0"/>
+          <w:numId w:val="3"/>
+        </w:numPr>
+      </w:pPr>
+      <w:r>
+        <w:t>Ed Bick</w:t>
+      </w:r>
+      <w:r>
+        <w:t>le</w:t>
+      </w:r>
+      <w:r>
+        <w:t>y</w:t>
+      </w:r>
+    </w:p>
+    <w:p>
+      <w:pPr>
+        <w:pStyle w:val="ListParagraph"/>
+        <w:numPr>
+          <w:ilvl w:val="0"/>
+          <w:numId w:val="3"/>
+        </w:numPr>
+      </w:pPr>
+      <w:r>
+        <w:t>Oliver Methold</w:t>
+      </w:r>
+    </w:p>
+    <w:p>
+      <w:pPr>
+        <w:pStyle w:val="ListParagraph"/>
+        <w:numPr>
+          <w:ilvl w:val="0"/>
+          <w:numId w:val="3"/>
+        </w:numPr>
+      </w:pPr>
+      <w:r>
+        <w:t>Oliver Edwards</w:t>
+      </w:r>
+    </w:p>
+    <w:p>
+      <w:r>
+        <w:t>Key points</w:t>
+      </w:r>
+    </w:p>
+    <w:p>
+      <w:pPr>
+        <w:pStyle w:val="ListParagraph"/>
+        <w:numPr>
+          <w:ilvl w:val="0"/>
+          <w:numId w:val="3"/>
+        </w:numPr>
+      </w:pPr>
+      <w:r>
         <w:t>Reflection of 1</w:t>
       </w:r>
       <w:r>
@@ -277,23 +1017,208 @@
         <w:t>Plans for next scrum</w:t>
       </w:r>
     </w:p>
+    <w:p>
+      <w:r>
+        <w:t>Approved Motions:</w:t>
+      </w:r>
+    </w:p>
+    <w:p>
+      <w:pPr>
+        <w:pStyle w:val="ListParagraph"/>
+        <w:numPr>
+          <w:ilvl w:val="0"/>
+          <w:numId w:val="13"/>
+        </w:numPr>
+      </w:pPr>
+      <w:r>
+        <w:t>Make a simple login system without RBAC</w:t>
+      </w:r>
+    </w:p>
+    <w:p>
+      <w:pPr>
+        <w:pStyle w:val="ListParagraph"/>
+        <w:numPr>
+          <w:ilvl w:val="0"/>
+          <w:numId w:val="13"/>
+        </w:numPr>
+      </w:pPr>
+      <w:r>
+        <w:t>Make a simple home page</w:t>
+      </w:r>
+    </w:p>
+    <w:p>
+      <w:pPr>
+        <w:pStyle w:val="ListParagraph"/>
+        <w:numPr>
+          <w:ilvl w:val="0"/>
+          <w:numId w:val="13"/>
+        </w:numPr>
+      </w:pPr>
+      <w:r>
+        <w:t>Test backend comments</w:t>
+      </w:r>
+    </w:p>
+    <w:p>
+      <w:pPr>
+        <w:pStyle w:val="ListParagraph"/>
+        <w:numPr>
+          <w:ilvl w:val="0"/>
+          <w:numId w:val="13"/>
+        </w:numPr>
+      </w:pPr>
+      <w:r>
+        <w:t>Finish researching cases and adding them to the website</w:t>
+      </w:r>
+    </w:p>
+    <w:p>
+      <w:pPr>
+        <w:pStyle w:val="ListParagraph"/>
+        <w:numPr>
+          <w:ilvl w:val="0"/>
+          <w:numId w:val="13"/>
+        </w:numPr>
+      </w:pPr>
+      <w:r>
+        <w:t>Finish licen</w:t>
+      </w:r>
+      <w:r>
+        <w:t>sing documentation</w:t>
+      </w:r>
+    </w:p>
     <w:p/>
-    <w:p>
-      <w:pPr>
-        <w:rPr>
-          <w:b/>
-          <w:bCs/>
-          <w:u w:val="single"/>
-        </w:rPr>
-      </w:pPr>
-      <w:r>
-        <w:rPr>
-          <w:b/>
-          <w:bCs/>
-          <w:u w:val="single"/>
-        </w:rPr>
+    <w:p/>
+    <w:p>
+      <w:pPr>
+        <w:rPr>
+          <w:b/>
+          <w:bCs/>
+          <w:u w:val="single"/>
+        </w:rPr>
+      </w:pPr>
+    </w:p>
+    <w:p>
+      <w:pPr>
+        <w:rPr>
+          <w:b/>
+          <w:bCs/>
+          <w:u w:val="single"/>
+        </w:rPr>
+      </w:pPr>
+    </w:p>
+    <w:p>
+      <w:pPr>
+        <w:rPr>
+          <w:b/>
+          <w:bCs/>
+          <w:u w:val="single"/>
+        </w:rPr>
+      </w:pPr>
+    </w:p>
+    <w:p>
+      <w:pPr>
+        <w:rPr>
+          <w:b/>
+          <w:bCs/>
+          <w:u w:val="single"/>
+        </w:rPr>
+      </w:pPr>
+    </w:p>
+    <w:p>
+      <w:pPr>
+        <w:rPr>
+          <w:b/>
+          <w:bCs/>
+          <w:u w:val="single"/>
+        </w:rPr>
+      </w:pPr>
+    </w:p>
+    <w:p>
+      <w:pPr>
+        <w:rPr>
+          <w:b/>
+          <w:bCs/>
+          <w:u w:val="single"/>
+        </w:rPr>
+      </w:pPr>
+    </w:p>
+    <w:p>
+      <w:pPr>
+        <w:rPr>
+          <w:b/>
+          <w:bCs/>
+          <w:u w:val="single"/>
+        </w:rPr>
+      </w:pPr>
+    </w:p>
+    <w:p>
+      <w:pPr>
+        <w:rPr>
+          <w:b/>
+          <w:bCs/>
+          <w:u w:val="single"/>
+        </w:rPr>
+      </w:pPr>
+    </w:p>
+    <w:p>
+      <w:pPr>
+        <w:rPr>
+          <w:b/>
+          <w:bCs/>
+          <w:u w:val="single"/>
+        </w:rPr>
+      </w:pPr>
+    </w:p>
+    <w:p>
+      <w:pPr>
+        <w:rPr>
+          <w:b/>
+          <w:bCs/>
+          <w:u w:val="single"/>
+        </w:rPr>
+      </w:pPr>
+    </w:p>
+    <w:p>
+      <w:pPr>
+        <w:rPr>
+          <w:b/>
+          <w:bCs/>
+          <w:u w:val="single"/>
+        </w:rPr>
+      </w:pPr>
+    </w:p>
+    <w:p>
+      <w:pPr>
+        <w:rPr>
+          <w:b/>
+          <w:bCs/>
+          <w:u w:val="single"/>
+        </w:rPr>
+      </w:pPr>
+      <w:r>
+        <w:rPr>
+          <w:b/>
+          <w:bCs/>
+          <w:u w:val="single"/>
+        </w:rPr>
+        <w:lastRenderedPageBreak/>
         <w:t>09/02/2026</w:t>
       </w:r>
+      <w:r>
+        <w:rPr>
+          <w:b/>
+          <w:bCs/>
+          <w:u w:val="single"/>
+        </w:rPr>
+        <w:t xml:space="preserve"> </w:t>
+      </w:r>
+      <w:r>
+        <w:rPr>
+          <w:b/>
+          <w:bCs/>
+          <w:u w:val="single"/>
+        </w:rPr>
+        <w:t>Innovation Centre 1</w:t>
+      </w:r>
     </w:p>
     <w:p>
       <w:r>
@@ -301,6 +1226,66 @@
       </w:r>
     </w:p>
     <w:p>
+      <w:r>
+        <w:t xml:space="preserve">A mandatory meeting with module lead </w:t>
+      </w:r>
+      <w:r>
+        <w:t>to discuss how far we are with the projec</w:t>
+      </w:r>
+      <w:r>
+        <w:t>t.</w:t>
+      </w:r>
+    </w:p>
+    <w:p>
+      <w:r>
+        <w:t>Members Present:</w:t>
+      </w:r>
+    </w:p>
+    <w:p>
+      <w:pPr>
+        <w:pStyle w:val="ListParagraph"/>
+        <w:numPr>
+          <w:ilvl w:val="0"/>
+          <w:numId w:val="14"/>
+        </w:numPr>
+      </w:pPr>
+      <w:r>
+        <w:t>Chase Sibley</w:t>
+      </w:r>
+    </w:p>
+    <w:p>
+      <w:pPr>
+        <w:pStyle w:val="ListParagraph"/>
+        <w:numPr>
+          <w:ilvl w:val="0"/>
+          <w:numId w:val="14"/>
+        </w:numPr>
+      </w:pPr>
+      <w:r>
+        <w:t>Alistar Bishop</w:t>
+      </w:r>
+    </w:p>
+    <w:p>
+      <w:pPr>
+        <w:pStyle w:val="ListParagraph"/>
+        <w:numPr>
+          <w:ilvl w:val="0"/>
+          <w:numId w:val="14"/>
+        </w:numPr>
+      </w:pPr>
+      <w:r>
+        <w:t>Sam Taylor-King</w:t>
+      </w:r>
+    </w:p>
+    <w:p>
+      <w:r>
+        <w:t>Key Points</w:t>
+      </w:r>
+      <w:r>
+        <w:t>:</w:t>
+      </w:r>
+    </w:p>
+    <w:p>
       <w:pPr>
         <w:pStyle w:val="ListParagraph"/>
         <w:numPr>
@@ -348,7 +1333,180 @@
         <w:t>Booked presentation date</w:t>
       </w:r>
     </w:p>
+    <w:p>
+      <w:r>
+        <w:t>Approved Motions:</w:t>
+      </w:r>
+    </w:p>
+    <w:p>
+      <w:pPr>
+        <w:pStyle w:val="ListParagraph"/>
+        <w:numPr>
+          <w:ilvl w:val="0"/>
+          <w:numId w:val="15"/>
+        </w:numPr>
+      </w:pPr>
+      <w:r>
+        <w:t xml:space="preserve">Finish </w:t>
+      </w:r>
+      <w:r>
+        <w:t>t</w:t>
+      </w:r>
+      <w:r>
+        <w:t>esting</w:t>
+      </w:r>
+    </w:p>
+    <w:p>
+      <w:pPr>
+        <w:pStyle w:val="ListParagraph"/>
+        <w:numPr>
+          <w:ilvl w:val="0"/>
+          <w:numId w:val="15"/>
+        </w:numPr>
+      </w:pPr>
+      <w:r>
+        <w:t>Finish documentation ready for submission</w:t>
+      </w:r>
+    </w:p>
+    <w:p>
+      <w:pPr>
+        <w:pStyle w:val="ListParagraph"/>
+        <w:numPr>
+          <w:ilvl w:val="0"/>
+          <w:numId w:val="15"/>
+        </w:numPr>
+      </w:pPr>
+      <w:r>
+        <w:t>Ensure full functionality of prototype</w:t>
+      </w:r>
+    </w:p>
     <w:p/>
+    <w:p>
+      <w:pPr>
+        <w:rPr>
+          <w:b/>
+          <w:bCs/>
+          <w:u w:val="single"/>
+        </w:rPr>
+      </w:pPr>
+    </w:p>
+    <w:p>
+      <w:pPr>
+        <w:rPr>
+          <w:b/>
+          <w:bCs/>
+          <w:u w:val="single"/>
+        </w:rPr>
+      </w:pPr>
+    </w:p>
+    <w:p>
+      <w:pPr>
+        <w:rPr>
+          <w:b/>
+          <w:bCs/>
+          <w:u w:val="single"/>
+        </w:rPr>
+      </w:pPr>
+    </w:p>
+    <w:p>
+      <w:pPr>
+        <w:rPr>
+          <w:b/>
+          <w:bCs/>
+          <w:u w:val="single"/>
+        </w:rPr>
+      </w:pPr>
+    </w:p>
+    <w:p>
+      <w:pPr>
+        <w:rPr>
+          <w:b/>
+          <w:bCs/>
+          <w:u w:val="single"/>
+        </w:rPr>
+      </w:pPr>
+    </w:p>
+    <w:p>
+      <w:pPr>
+        <w:rPr>
+          <w:b/>
+          <w:bCs/>
+          <w:u w:val="single"/>
+        </w:rPr>
+      </w:pPr>
+    </w:p>
+    <w:p>
+      <w:pPr>
+        <w:rPr>
+          <w:b/>
+          <w:bCs/>
+          <w:u w:val="single"/>
+        </w:rPr>
+      </w:pPr>
+    </w:p>
+    <w:p>
+      <w:pPr>
+        <w:rPr>
+          <w:b/>
+          <w:bCs/>
+          <w:u w:val="single"/>
+        </w:rPr>
+      </w:pPr>
+    </w:p>
+    <w:p>
+      <w:pPr>
+        <w:rPr>
+          <w:b/>
+          <w:bCs/>
+          <w:u w:val="single"/>
+        </w:rPr>
+      </w:pPr>
+    </w:p>
+    <w:p>
+      <w:pPr>
+        <w:rPr>
+          <w:b/>
+          <w:bCs/>
+          <w:u w:val="single"/>
+        </w:rPr>
+      </w:pPr>
+    </w:p>
+    <w:p>
+      <w:pPr>
+        <w:rPr>
+          <w:b/>
+          <w:bCs/>
+          <w:u w:val="single"/>
+        </w:rPr>
+      </w:pPr>
+    </w:p>
+    <w:p>
+      <w:pPr>
+        <w:rPr>
+          <w:b/>
+          <w:bCs/>
+          <w:u w:val="single"/>
+        </w:rPr>
+      </w:pPr>
+    </w:p>
+    <w:p>
+      <w:pPr>
+        <w:rPr>
+          <w:b/>
+          <w:bCs/>
+          <w:u w:val="single"/>
+        </w:rPr>
+      </w:pPr>
+    </w:p>
+    <w:p>
+      <w:pPr>
+        <w:rPr>
+          <w:b/>
+          <w:bCs/>
+          <w:u w:val="single"/>
+        </w:rPr>
+      </w:pPr>
+    </w:p>
     <w:p>
       <w:pPr>
         <w:rPr>
@@ -384,11 +1542,124 @@
         <w:lastRenderedPageBreak/>
         <w:t>15/02/2026</w:t>
       </w:r>
+      <w:r>
+        <w:rPr>
+          <w:b/>
+          <w:bCs/>
+          <w:u w:val="single"/>
+        </w:rPr>
+        <w:t xml:space="preserve"> Library</w:t>
+      </w:r>
     </w:p>
     <w:p>
       <w:r>
         <w:t xml:space="preserve">15:20 – </w:t>
       </w:r>
+      <w:r>
+        <w:t>17:00 (</w:t>
+      </w:r>
+      <w:r>
+        <w:t>100 minutes)</w:t>
+      </w:r>
+    </w:p>
+    <w:p>
+      <w:r>
+        <w:t>A meeting to discuss the presentation and what need to be finalised ready for submission this week.</w:t>
+      </w:r>
+    </w:p>
+    <w:p>
+      <w:r>
+        <w:t>Members Present:</w:t>
+      </w:r>
+    </w:p>
+    <w:p>
+      <w:pPr>
+        <w:pStyle w:val="ListParagraph"/>
+        <w:numPr>
+          <w:ilvl w:val="0"/>
+          <w:numId w:val="3"/>
+        </w:numPr>
+      </w:pPr>
+      <w:r>
+        <w:t>Chase Sibley</w:t>
+      </w:r>
+    </w:p>
+    <w:p>
+      <w:pPr>
+        <w:pStyle w:val="ListParagraph"/>
+        <w:numPr>
+          <w:ilvl w:val="0"/>
+          <w:numId w:val="3"/>
+        </w:numPr>
+      </w:pPr>
+      <w:r>
+        <w:t>Alistar Bishop</w:t>
+      </w:r>
+    </w:p>
+    <w:p>
+      <w:pPr>
+        <w:pStyle w:val="ListParagraph"/>
+        <w:numPr>
+          <w:ilvl w:val="0"/>
+          <w:numId w:val="3"/>
+        </w:numPr>
+      </w:pPr>
+      <w:r>
+        <w:t>Sam Taylor-King</w:t>
+      </w:r>
+    </w:p>
+    <w:p>
+      <w:pPr>
+        <w:pStyle w:val="ListParagraph"/>
+        <w:numPr>
+          <w:ilvl w:val="0"/>
+          <w:numId w:val="3"/>
+        </w:numPr>
+      </w:pPr>
+      <w:r>
+        <w:t>Ted Turner</w:t>
+      </w:r>
+    </w:p>
+    <w:p>
+      <w:pPr>
+        <w:pStyle w:val="ListParagraph"/>
+        <w:numPr>
+          <w:ilvl w:val="0"/>
+          <w:numId w:val="3"/>
+        </w:numPr>
+      </w:pPr>
+      <w:r>
+        <w:t>Ed Bickley</w:t>
+      </w:r>
+    </w:p>
+    <w:p>
+      <w:pPr>
+        <w:pStyle w:val="ListParagraph"/>
+        <w:numPr>
+          <w:ilvl w:val="0"/>
+          <w:numId w:val="3"/>
+        </w:numPr>
+      </w:pPr>
+      <w:r>
+        <w:t>Oliver Methold</w:t>
+      </w:r>
+    </w:p>
+    <w:p>
+      <w:pPr>
+        <w:pStyle w:val="ListParagraph"/>
+        <w:numPr>
+          <w:ilvl w:val="0"/>
+          <w:numId w:val="3"/>
+        </w:numPr>
+      </w:pPr>
+      <w:r>
+        <w:t>Oliver Edwards</w:t>
+      </w:r>
+    </w:p>
+    <w:p>
+      <w:r>
+        <w:t>Key Points:</w:t>
+      </w:r>
     </w:p>
     <w:p>
       <w:pPr>
@@ -414,7 +1685,13 @@
         </w:numPr>
       </w:pPr>
       <w:r>
-        <w:t xml:space="preserve">Discussed future plans for </w:t>
+        <w:t xml:space="preserve">Discussed </w:t>
+      </w:r>
+      <w:r>
+        <w:t>future</w:t>
+      </w:r>
+      <w:r>
+        <w:t xml:space="preserve"> for </w:t>
       </w:r>
       <w:r>
         <w:t>the final product</w:t>
@@ -433,6 +1710,345 @@
       </w:r>
       <w:r>
         <w:t xml:space="preserve"> parts</w:t>
+      </w:r>
+    </w:p>
+    <w:p>
+      <w:r>
+        <w:t>Approved Motions</w:t>
+      </w:r>
+      <w:r>
+        <w:t>:</w:t>
+      </w:r>
+    </w:p>
+    <w:p>
+      <w:pPr>
+        <w:pStyle w:val="ListParagraph"/>
+        <w:numPr>
+          <w:ilvl w:val="0"/>
+          <w:numId w:val="16"/>
+        </w:numPr>
+      </w:pPr>
+      <w:r>
+        <w:t>Have files ready to be submitted</w:t>
+      </w:r>
+    </w:p>
+    <w:p>
+      <w:pPr>
+        <w:pStyle w:val="ListParagraph"/>
+        <w:numPr>
+          <w:ilvl w:val="0"/>
+          <w:numId w:val="16"/>
+        </w:numPr>
+      </w:pPr>
+      <w:r>
+        <w:t>Finish diagrams</w:t>
+      </w:r>
+    </w:p>
+    <w:p>
+      <w:pPr>
+        <w:pStyle w:val="ListParagraph"/>
+        <w:numPr>
+          <w:ilvl w:val="0"/>
+          <w:numId w:val="16"/>
+        </w:numPr>
+      </w:pPr>
+      <w:r>
+        <w:t>Make presentation slides</w:t>
+      </w:r>
+    </w:p>
+    <w:p/>
+    <w:p>
+      <w:pPr>
+        <w:rPr>
+          <w:b/>
+          <w:bCs/>
+          <w:u w:val="single"/>
+        </w:rPr>
+      </w:pPr>
+    </w:p>
+    <w:p>
+      <w:pPr>
+        <w:rPr>
+          <w:b/>
+          <w:bCs/>
+          <w:u w:val="single"/>
+        </w:rPr>
+      </w:pPr>
+    </w:p>
+    <w:p>
+      <w:pPr>
+        <w:rPr>
+          <w:b/>
+          <w:bCs/>
+          <w:u w:val="single"/>
+        </w:rPr>
+      </w:pPr>
+    </w:p>
+    <w:p>
+      <w:pPr>
+        <w:rPr>
+          <w:b/>
+          <w:bCs/>
+          <w:u w:val="single"/>
+        </w:rPr>
+      </w:pPr>
+    </w:p>
+    <w:p>
+      <w:pPr>
+        <w:rPr>
+          <w:b/>
+          <w:bCs/>
+          <w:u w:val="single"/>
+        </w:rPr>
+      </w:pPr>
+    </w:p>
+    <w:p>
+      <w:pPr>
+        <w:rPr>
+          <w:b/>
+          <w:bCs/>
+          <w:u w:val="single"/>
+        </w:rPr>
+      </w:pPr>
+    </w:p>
+    <w:p>
+      <w:pPr>
+        <w:rPr>
+          <w:b/>
+          <w:bCs/>
+          <w:u w:val="single"/>
+        </w:rPr>
+      </w:pPr>
+    </w:p>
+    <w:p>
+      <w:pPr>
+        <w:rPr>
+          <w:b/>
+          <w:bCs/>
+          <w:u w:val="single"/>
+        </w:rPr>
+      </w:pPr>
+    </w:p>
+    <w:p>
+      <w:pPr>
+        <w:rPr>
+          <w:b/>
+          <w:bCs/>
+          <w:u w:val="single"/>
+        </w:rPr>
+      </w:pPr>
+    </w:p>
+    <w:p>
+      <w:pPr>
+        <w:rPr>
+          <w:b/>
+          <w:bCs/>
+          <w:u w:val="single"/>
+        </w:rPr>
+      </w:pPr>
+    </w:p>
+    <w:p>
+      <w:pPr>
+        <w:rPr>
+          <w:b/>
+          <w:bCs/>
+          <w:u w:val="single"/>
+        </w:rPr>
+      </w:pPr>
+    </w:p>
+    <w:p>
+      <w:pPr>
+        <w:rPr>
+          <w:b/>
+          <w:bCs/>
+          <w:u w:val="single"/>
+        </w:rPr>
+      </w:pPr>
+    </w:p>
+    <w:p>
+      <w:pPr>
+        <w:rPr>
+          <w:b/>
+          <w:bCs/>
+          <w:u w:val="single"/>
+        </w:rPr>
+      </w:pPr>
+      <w:r>
+        <w:rPr>
+          <w:b/>
+          <w:bCs/>
+          <w:u w:val="single"/>
+        </w:rPr>
+        <w:t>16/02/2026</w:t>
+      </w:r>
+      <w:r>
+        <w:rPr>
+          <w:b/>
+          <w:bCs/>
+          <w:u w:val="single"/>
+        </w:rPr>
+        <w:t xml:space="preserve"> Innovation Centre 2</w:t>
+      </w:r>
+    </w:p>
+    <w:p>
+      <w:r>
+        <w:lastRenderedPageBreak/>
+        <w:t>10:00 – 12:00</w:t>
+      </w:r>
+      <w:r>
+        <w:t xml:space="preserve"> (120 minutes)</w:t>
+      </w:r>
+    </w:p>
+    <w:p>
+      <w:r>
+        <w:t>A meeting before our presentation to have a rundown and practise</w:t>
+      </w:r>
+      <w:r>
+        <w:t>.</w:t>
+      </w:r>
+    </w:p>
+    <w:p>
+      <w:r>
+        <w:t>Members Present:</w:t>
+      </w:r>
+    </w:p>
+    <w:p>
+      <w:pPr>
+        <w:pStyle w:val="ListParagraph"/>
+        <w:numPr>
+          <w:ilvl w:val="0"/>
+          <w:numId w:val="3"/>
+        </w:numPr>
+      </w:pPr>
+      <w:r>
+        <w:t>Chase Sibley</w:t>
+      </w:r>
+    </w:p>
+    <w:p>
+      <w:pPr>
+        <w:pStyle w:val="ListParagraph"/>
+        <w:numPr>
+          <w:ilvl w:val="0"/>
+          <w:numId w:val="3"/>
+        </w:numPr>
+      </w:pPr>
+      <w:r>
+        <w:t>Alistar Bishop</w:t>
+      </w:r>
+    </w:p>
+    <w:p>
+      <w:pPr>
+        <w:pStyle w:val="ListParagraph"/>
+        <w:numPr>
+          <w:ilvl w:val="0"/>
+          <w:numId w:val="3"/>
+        </w:numPr>
+      </w:pPr>
+      <w:r>
+        <w:t>Sam Taylor-King</w:t>
+      </w:r>
+    </w:p>
+    <w:p>
+      <w:pPr>
+        <w:pStyle w:val="ListParagraph"/>
+        <w:numPr>
+          <w:ilvl w:val="0"/>
+          <w:numId w:val="3"/>
+        </w:numPr>
+      </w:pPr>
+      <w:r>
+        <w:t>Ted Turner</w:t>
+      </w:r>
+    </w:p>
+    <w:p>
+      <w:pPr>
+        <w:pStyle w:val="ListParagraph"/>
+        <w:numPr>
+          <w:ilvl w:val="0"/>
+          <w:numId w:val="3"/>
+        </w:numPr>
+      </w:pPr>
+      <w:r>
+        <w:t>Ed Bickley</w:t>
+      </w:r>
+    </w:p>
+    <w:p>
+      <w:pPr>
+        <w:pStyle w:val="ListParagraph"/>
+        <w:numPr>
+          <w:ilvl w:val="0"/>
+          <w:numId w:val="3"/>
+        </w:numPr>
+      </w:pPr>
+      <w:r>
+        <w:t>Oliver Methold</w:t>
+      </w:r>
+    </w:p>
+    <w:p>
+      <w:pPr>
+        <w:pStyle w:val="ListParagraph"/>
+        <w:numPr>
+          <w:ilvl w:val="0"/>
+          <w:numId w:val="3"/>
+        </w:numPr>
+      </w:pPr>
+      <w:r>
+        <w:t>Oliver Edwards</w:t>
+      </w:r>
+    </w:p>
+    <w:p>
+      <w:r>
+        <w:t>Ke</w:t>
+      </w:r>
+      <w:r>
+        <w:t>y</w:t>
+      </w:r>
+      <w:r>
+        <w:t xml:space="preserve"> Points:</w:t>
+      </w:r>
+    </w:p>
+    <w:p>
+      <w:pPr>
+        <w:pStyle w:val="ListParagraph"/>
+        <w:numPr>
+          <w:ilvl w:val="0"/>
+          <w:numId w:val="7"/>
+        </w:numPr>
+      </w:pPr>
+      <w:r>
+        <w:t>Presentation preparation and practise</w:t>
+      </w:r>
+      <w:r>
+        <w:t xml:space="preserve"> (Presentation at 12:00)</w:t>
+      </w:r>
+    </w:p>
+    <w:p>
+      <w:pPr>
+        <w:pStyle w:val="ListParagraph"/>
+        <w:numPr>
+          <w:ilvl w:val="0"/>
+          <w:numId w:val="7"/>
+        </w:numPr>
+      </w:pPr>
+      <w:r>
+        <w:t xml:space="preserve">Adding submission files </w:t>
+      </w:r>
+    </w:p>
+    <w:p>
+      <w:r>
+        <w:t xml:space="preserve">Approved Motions: </w:t>
+      </w:r>
+    </w:p>
+    <w:p>
+      <w:pPr>
+        <w:pStyle w:val="ListParagraph"/>
+        <w:numPr>
+          <w:ilvl w:val="0"/>
+          <w:numId w:val="17"/>
+        </w:numPr>
+      </w:pPr>
+      <w:r>
+        <w:t>Add all files for submission</w:t>
       </w:r>
     </w:p>
     <w:sectPr>
@@ -448,6 +2064,345 @@
 <file path=word/numbering.xml><?xml version="1.0" encoding="utf-8"?>
 <w:numbering xmlns:wpc="http://schemas.microsoft.com/office/word/2010/wordprocessingCanvas" xmlns:cx="http://schemas.microsoft.com/office/drawing/2014/chartex" xmlns:cx1="http://schemas.microsoft.com/office/drawing/2015/9/8/chartex" xmlns:cx2="http://schemas.microsoft.com/office/drawing/2015/10/21/chartex" xmlns:cx3="http://schemas.microsoft.com/office/drawing/2016/5/9/chartex" xmlns:cx4="http://schemas.microsoft.com/office/drawing/2016/5/10/chartex" xmlns:cx5="http://schemas.microsoft.com/office/drawing/2016/5/11/chartex" xmlns:cx6="http://schemas.microsoft.com/office/drawing/2016/5/12/chartex" xmlns:cx7="http://schemas.microsoft.com/office/drawing/2016/5/13/chartex" xmlns:cx8="http://schemas.microsoft.com/office/drawing/2016/5/14/chartex" xmlns:mc="http://schemas.openxmlformats.org/markup-compatibility/2006" xmlns:aink="http://schemas.microsoft.com/office/drawing/2016/ink" xmlns:am3d="http://schemas.microsoft.com/office/drawing/2017/model3d" xmlns:o="urn:schemas-microsoft-com:office:office" xmlns:oel="http://schemas.microsoft.com/office/2019/extlst" xmlns:r="http://schemas.openxmlformats.org/officeDocument/2006/relationships" xmlns:m="http://schemas.openxmlformats.org/officeDocument/2006/math" xmlns:v="urn:schemas-microsoft-com:vml" xmlns:wp14="http://schemas.microsoft.com/office/word/2010/wordprocessingDrawing" xmlns:wp="http://schemas.openxmlformats.org/drawingml/2006/wordprocessingDrawing" xmlns:w10="urn:schemas-microsoft-com:office:word" xmlns:w="http://schemas.openxmlformats.org/wordprocessingml/2006/main" xmlns:w14="http://schemas.microsoft.com/office/word/2010/wordml" xmlns:w15="http://schemas.microsoft.com/office/word/2012/wordml" xmlns:w16cex="http://schemas.microsoft.com/office/word/2018/wordml/cex" xmlns:w16cid="http://schemas.microsoft.com/office/word/2016/wordml/cid" xmlns:w16="http://schemas.microsoft.com/office/word/2018/wordml" xmlns:w16du="http://schemas.microsoft.com/office/word/2023/wordml/word16du" xmlns:w16sdtdh="http://schemas.microsoft.com/office/word/2020/wordml/sdtdatahash" xmlns:w16sdtfl="http://schemas.microsoft.com/office/word/2024/wordml/sdtformatlock" xmlns:w16se="http://schemas.microsoft.com/office/word/2015/wordml/symex" xmlns:wpg="http://schemas.microsoft.com/office/word/2010/wordprocessingGroup" xmlns:wpi="http://schemas.microsoft.com/office/word/2010/wordprocessingInk" xmlns:wne="http://schemas.microsoft.com/office/word/2006/wordml" xmlns:wps="http://schemas.microsoft.com/office/word/2010/wordprocessingShape" mc:Ignorable="w14 w15 w16se w16cid w16 w16cex w16sdtdh w16sdtfl w16du wp14">
   <w:abstractNum w:abstractNumId="0" w15:restartNumberingAfterBreak="0">
+    <w:nsid w:val="04706252"/>
+    <w:multiLevelType w:val="hybridMultilevel"/>
+    <w:tmpl w:val="7C96EF5A"/>
+    <w:lvl w:ilvl="0" w:tplc="08090001">
+      <w:start w:val="1"/>
+      <w:numFmt w:val="bullet"/>
+      <w:lvlText w:val=""/>
+      <w:lvlJc w:val="left"/>
+      <w:pPr>
+        <w:ind w:left="720" w:hanging="360"/>
+      </w:pPr>
+      <w:rPr>
+        <w:rFonts w:ascii="Symbol" w:hAnsi="Symbol" w:hint="default"/>
+      </w:rPr>
+    </w:lvl>
+    <w:lvl w:ilvl="1" w:tplc="08090003" w:tentative="1">
+      <w:start w:val="1"/>
+      <w:numFmt w:val="bullet"/>
+      <w:lvlText w:val="o"/>
+      <w:lvlJc w:val="left"/>
+      <w:pPr>
+        <w:ind w:left="1440" w:hanging="360"/>
+      </w:pPr>
+      <w:rPr>
+        <w:rFonts w:ascii="Courier New" w:hAnsi="Courier New" w:cs="Courier New" w:hint="default"/>
+      </w:rPr>
+    </w:lvl>
+    <w:lvl w:ilvl="2" w:tplc="08090005" w:tentative="1">
+      <w:start w:val="1"/>
+      <w:numFmt w:val="bullet"/>
+      <w:lvlText w:val=""/>
+      <w:lvlJc w:val="left"/>
+      <w:pPr>
+        <w:ind w:left="2160" w:hanging="360"/>
+      </w:pPr>
+      <w:rPr>
+        <w:rFonts w:ascii="Wingdings" w:hAnsi="Wingdings" w:hint="default"/>
+      </w:rPr>
+    </w:lvl>
+    <w:lvl w:ilvl="3" w:tplc="08090001" w:tentative="1">
+      <w:start w:val="1"/>
+      <w:numFmt w:val="bullet"/>
+      <w:lvlText w:val=""/>
+      <w:lvlJc w:val="left"/>
+      <w:pPr>
+        <w:ind w:left="2880" w:hanging="360"/>
+      </w:pPr>
+      <w:rPr>
+        <w:rFonts w:ascii="Symbol" w:hAnsi="Symbol" w:hint="default"/>
+      </w:rPr>
+    </w:lvl>
+    <w:lvl w:ilvl="4" w:tplc="08090003" w:tentative="1">
+      <w:start w:val="1"/>
+      <w:numFmt w:val="bullet"/>
+      <w:lvlText w:val="o"/>
+      <w:lvlJc w:val="left"/>
+      <w:pPr>
+        <w:ind w:left="3600" w:hanging="360"/>
+      </w:pPr>
+      <w:rPr>
+        <w:rFonts w:ascii="Courier New" w:hAnsi="Courier New" w:cs="Courier New" w:hint="default"/>
+      </w:rPr>
+    </w:lvl>
+    <w:lvl w:ilvl="5" w:tplc="08090005" w:tentative="1">
+      <w:start w:val="1"/>
+      <w:numFmt w:val="bullet"/>
+      <w:lvlText w:val=""/>
+      <w:lvlJc w:val="left"/>
+      <w:pPr>
+        <w:ind w:left="4320" w:hanging="360"/>
+      </w:pPr>
+      <w:rPr>
+        <w:rFonts w:ascii="Wingdings" w:hAnsi="Wingdings" w:hint="default"/>
+      </w:rPr>
+    </w:lvl>
+    <w:lvl w:ilvl="6" w:tplc="08090001" w:tentative="1">
+      <w:start w:val="1"/>
+      <w:numFmt w:val="bullet"/>
+      <w:lvlText w:val=""/>
+      <w:lvlJc w:val="left"/>
+      <w:pPr>
+        <w:ind w:left="5040" w:hanging="360"/>
+      </w:pPr>
+      <w:rPr>
+        <w:rFonts w:ascii="Symbol" w:hAnsi="Symbol" w:hint="default"/>
+      </w:rPr>
+    </w:lvl>
+    <w:lvl w:ilvl="7" w:tplc="08090003" w:tentative="1">
+      <w:start w:val="1"/>
+      <w:numFmt w:val="bullet"/>
+      <w:lvlText w:val="o"/>
+      <w:lvlJc w:val="left"/>
+      <w:pPr>
+        <w:ind w:left="5760" w:hanging="360"/>
+      </w:pPr>
+      <w:rPr>
+        <w:rFonts w:ascii="Courier New" w:hAnsi="Courier New" w:cs="Courier New" w:hint="default"/>
+      </w:rPr>
+    </w:lvl>
+    <w:lvl w:ilvl="8" w:tplc="08090005" w:tentative="1">
+      <w:start w:val="1"/>
+      <w:numFmt w:val="bullet"/>
+      <w:lvlText w:val=""/>
+      <w:lvlJc w:val="left"/>
+      <w:pPr>
+        <w:ind w:left="6480" w:hanging="360"/>
+      </w:pPr>
+      <w:rPr>
+        <w:rFonts w:ascii="Wingdings" w:hAnsi="Wingdings" w:hint="default"/>
+      </w:rPr>
+    </w:lvl>
+  </w:abstractNum>
+  <w:abstractNum w:abstractNumId="1" w15:restartNumberingAfterBreak="0">
+    <w:nsid w:val="066D44DE"/>
+    <w:multiLevelType w:val="hybridMultilevel"/>
+    <w:tmpl w:val="98244188"/>
+    <w:lvl w:ilvl="0" w:tplc="08090001">
+      <w:start w:val="1"/>
+      <w:numFmt w:val="bullet"/>
+      <w:lvlText w:val=""/>
+      <w:lvlJc w:val="left"/>
+      <w:pPr>
+        <w:ind w:left="720" w:hanging="360"/>
+      </w:pPr>
+      <w:rPr>
+        <w:rFonts w:ascii="Symbol" w:hAnsi="Symbol" w:hint="default"/>
+      </w:rPr>
+    </w:lvl>
+    <w:lvl w:ilvl="1" w:tplc="08090003" w:tentative="1">
+      <w:start w:val="1"/>
+      <w:numFmt w:val="bullet"/>
+      <w:lvlText w:val="o"/>
+      <w:lvlJc w:val="left"/>
+      <w:pPr>
+        <w:ind w:left="1440" w:hanging="360"/>
+      </w:pPr>
+      <w:rPr>
+        <w:rFonts w:ascii="Courier New" w:hAnsi="Courier New" w:cs="Courier New" w:hint="default"/>
+      </w:rPr>
+    </w:lvl>
+    <w:lvl w:ilvl="2" w:tplc="08090005" w:tentative="1">
+      <w:start w:val="1"/>
+      <w:numFmt w:val="bullet"/>
+      <w:lvlText w:val=""/>
+      <w:lvlJc w:val="left"/>
+      <w:pPr>
+        <w:ind w:left="2160" w:hanging="360"/>
+      </w:pPr>
+      <w:rPr>
+        <w:rFonts w:ascii="Wingdings" w:hAnsi="Wingdings" w:hint="default"/>
+      </w:rPr>
+    </w:lvl>
+    <w:lvl w:ilvl="3" w:tplc="08090001" w:tentative="1">
+      <w:start w:val="1"/>
+      <w:numFmt w:val="bullet"/>
+      <w:lvlText w:val=""/>
+      <w:lvlJc w:val="left"/>
+      <w:pPr>
+        <w:ind w:left="2880" w:hanging="360"/>
+      </w:pPr>
+      <w:rPr>
+        <w:rFonts w:ascii="Symbol" w:hAnsi="Symbol" w:hint="default"/>
+      </w:rPr>
+    </w:lvl>
+    <w:lvl w:ilvl="4" w:tplc="08090003" w:tentative="1">
+      <w:start w:val="1"/>
+      <w:numFmt w:val="bullet"/>
+      <w:lvlText w:val="o"/>
+      <w:lvlJc w:val="left"/>
+      <w:pPr>
+        <w:ind w:left="3600" w:hanging="360"/>
+      </w:pPr>
+      <w:rPr>
+        <w:rFonts w:ascii="Courier New" w:hAnsi="Courier New" w:cs="Courier New" w:hint="default"/>
+      </w:rPr>
+    </w:lvl>
+    <w:lvl w:ilvl="5" w:tplc="08090005" w:tentative="1">
+      <w:start w:val="1"/>
+      <w:numFmt w:val="bullet"/>
+      <w:lvlText w:val=""/>
+      <w:lvlJc w:val="left"/>
+      <w:pPr>
+        <w:ind w:left="4320" w:hanging="360"/>
+      </w:pPr>
+      <w:rPr>
+        <w:rFonts w:ascii="Wingdings" w:hAnsi="Wingdings" w:hint="default"/>
+      </w:rPr>
+    </w:lvl>
+    <w:lvl w:ilvl="6" w:tplc="08090001" w:tentative="1">
+      <w:start w:val="1"/>
+      <w:numFmt w:val="bullet"/>
+      <w:lvlText w:val=""/>
+      <w:lvlJc w:val="left"/>
+      <w:pPr>
+        <w:ind w:left="5040" w:hanging="360"/>
+      </w:pPr>
+      <w:rPr>
+        <w:rFonts w:ascii="Symbol" w:hAnsi="Symbol" w:hint="default"/>
+      </w:rPr>
+    </w:lvl>
+    <w:lvl w:ilvl="7" w:tplc="08090003" w:tentative="1">
+      <w:start w:val="1"/>
+      <w:numFmt w:val="bullet"/>
+      <w:lvlText w:val="o"/>
+      <w:lvlJc w:val="left"/>
+      <w:pPr>
+        <w:ind w:left="5760" w:hanging="360"/>
+      </w:pPr>
+      <w:rPr>
+        <w:rFonts w:ascii="Courier New" w:hAnsi="Courier New" w:cs="Courier New" w:hint="default"/>
+      </w:rPr>
+    </w:lvl>
+    <w:lvl w:ilvl="8" w:tplc="08090005" w:tentative="1">
+      <w:start w:val="1"/>
+      <w:numFmt w:val="bullet"/>
+      <w:lvlText w:val=""/>
+      <w:lvlJc w:val="left"/>
+      <w:pPr>
+        <w:ind w:left="6480" w:hanging="360"/>
+      </w:pPr>
+      <w:rPr>
+        <w:rFonts w:ascii="Wingdings" w:hAnsi="Wingdings" w:hint="default"/>
+      </w:rPr>
+    </w:lvl>
+  </w:abstractNum>
+  <w:abstractNum w:abstractNumId="2" w15:restartNumberingAfterBreak="0">
+    <w:nsid w:val="0B416EFF"/>
+    <w:multiLevelType w:val="hybridMultilevel"/>
+    <w:tmpl w:val="F8CC363A"/>
+    <w:lvl w:ilvl="0" w:tplc="08090001">
+      <w:start w:val="1"/>
+      <w:numFmt w:val="bullet"/>
+      <w:lvlText w:val=""/>
+      <w:lvlJc w:val="left"/>
+      <w:pPr>
+        <w:ind w:left="720" w:hanging="360"/>
+      </w:pPr>
+      <w:rPr>
+        <w:rFonts w:ascii="Symbol" w:hAnsi="Symbol" w:hint="default"/>
+      </w:rPr>
+    </w:lvl>
+    <w:lvl w:ilvl="1" w:tplc="08090003" w:tentative="1">
+      <w:start w:val="1"/>
+      <w:numFmt w:val="bullet"/>
+      <w:lvlText w:val="o"/>
+      <w:lvlJc w:val="left"/>
+      <w:pPr>
+        <w:ind w:left="1440" w:hanging="360"/>
+      </w:pPr>
+      <w:rPr>
+        <w:rFonts w:ascii="Courier New" w:hAnsi="Courier New" w:cs="Courier New" w:hint="default"/>
+      </w:rPr>
+    </w:lvl>
+    <w:lvl w:ilvl="2" w:tplc="08090005" w:tentative="1">
+      <w:start w:val="1"/>
+      <w:numFmt w:val="bullet"/>
+      <w:lvlText w:val=""/>
+      <w:lvlJc w:val="left"/>
+      <w:pPr>
+        <w:ind w:left="2160" w:hanging="360"/>
+      </w:pPr>
+      <w:rPr>
+        <w:rFonts w:ascii="Wingdings" w:hAnsi="Wingdings" w:hint="default"/>
+      </w:rPr>
+    </w:lvl>
+    <w:lvl w:ilvl="3" w:tplc="08090001" w:tentative="1">
+      <w:start w:val="1"/>
+      <w:numFmt w:val="bullet"/>
+      <w:lvlText w:val=""/>
+      <w:lvlJc w:val="left"/>
+      <w:pPr>
+        <w:ind w:left="2880" w:hanging="360"/>
+      </w:pPr>
+      <w:rPr>
+        <w:rFonts w:ascii="Symbol" w:hAnsi="Symbol" w:hint="default"/>
+      </w:rPr>
+    </w:lvl>
+    <w:lvl w:ilvl="4" w:tplc="08090003" w:tentative="1">
+      <w:start w:val="1"/>
+      <w:numFmt w:val="bullet"/>
+      <w:lvlText w:val="o"/>
+      <w:lvlJc w:val="left"/>
+      <w:pPr>
+        <w:ind w:left="3600" w:hanging="360"/>
+      </w:pPr>
+      <w:rPr>
+        <w:rFonts w:ascii="Courier New" w:hAnsi="Courier New" w:cs="Courier New" w:hint="default"/>
+      </w:rPr>
+    </w:lvl>
+    <w:lvl w:ilvl="5" w:tplc="08090005" w:tentative="1">
+      <w:start w:val="1"/>
+      <w:numFmt w:val="bullet"/>
+      <w:lvlText w:val=""/>
+      <w:lvlJc w:val="left"/>
+      <w:pPr>
+        <w:ind w:left="4320" w:hanging="360"/>
+      </w:pPr>
+      <w:rPr>
+        <w:rFonts w:ascii="Wingdings" w:hAnsi="Wingdings" w:hint="default"/>
+      </w:rPr>
+    </w:lvl>
+    <w:lvl w:ilvl="6" w:tplc="08090001" w:tentative="1">
+      <w:start w:val="1"/>
+      <w:numFmt w:val="bullet"/>
+      <w:lvlText w:val=""/>
+      <w:lvlJc w:val="left"/>
+      <w:pPr>
+        <w:ind w:left="5040" w:hanging="360"/>
+      </w:pPr>
+      <w:rPr>
+        <w:rFonts w:ascii="Symbol" w:hAnsi="Symbol" w:hint="default"/>
+      </w:rPr>
+    </w:lvl>
+    <w:lvl w:ilvl="7" w:tplc="08090003" w:tentative="1">
+      <w:start w:val="1"/>
+      <w:numFmt w:val="bullet"/>
+      <w:lvlText w:val="o"/>
+      <w:lvlJc w:val="left"/>
+      <w:pPr>
+        <w:ind w:left="5760" w:hanging="360"/>
+      </w:pPr>
+      <w:rPr>
+        <w:rFonts w:ascii="Courier New" w:hAnsi="Courier New" w:cs="Courier New" w:hint="default"/>
+      </w:rPr>
+    </w:lvl>
+    <w:lvl w:ilvl="8" w:tplc="08090005" w:tentative="1">
+      <w:start w:val="1"/>
+      <w:numFmt w:val="bullet"/>
+      <w:lvlText w:val=""/>
+      <w:lvlJc w:val="left"/>
+      <w:pPr>
+        <w:ind w:left="6480" w:hanging="360"/>
+      </w:pPr>
+      <w:rPr>
+        <w:rFonts w:ascii="Wingdings" w:hAnsi="Wingdings" w:hint="default"/>
+      </w:rPr>
+    </w:lvl>
+  </w:abstractNum>
+  <w:abstractNum w:abstractNumId="3" w15:restartNumberingAfterBreak="0">
     <w:nsid w:val="14AA6E87"/>
     <w:multiLevelType w:val="hybridMultilevel"/>
     <w:tmpl w:val="088896A6"/>
@@ -560,7 +2515,572 @@
       </w:rPr>
     </w:lvl>
   </w:abstractNum>
-  <w:abstractNum w:abstractNumId="1" w15:restartNumberingAfterBreak="0">
+  <w:abstractNum w:abstractNumId="4" w15:restartNumberingAfterBreak="0">
+    <w:nsid w:val="1C047C7C"/>
+    <w:multiLevelType w:val="hybridMultilevel"/>
+    <w:tmpl w:val="B89E1AEC"/>
+    <w:lvl w:ilvl="0" w:tplc="08090001">
+      <w:start w:val="1"/>
+      <w:numFmt w:val="bullet"/>
+      <w:lvlText w:val=""/>
+      <w:lvlJc w:val="left"/>
+      <w:pPr>
+        <w:ind w:left="720" w:hanging="360"/>
+      </w:pPr>
+      <w:rPr>
+        <w:rFonts w:ascii="Symbol" w:hAnsi="Symbol" w:hint="default"/>
+      </w:rPr>
+    </w:lvl>
+    <w:lvl w:ilvl="1" w:tplc="08090003" w:tentative="1">
+      <w:start w:val="1"/>
+      <w:numFmt w:val="bullet"/>
+      <w:lvlText w:val="o"/>
+      <w:lvlJc w:val="left"/>
+      <w:pPr>
+        <w:ind w:left="1440" w:hanging="360"/>
+      </w:pPr>
+      <w:rPr>
+        <w:rFonts w:ascii="Courier New" w:hAnsi="Courier New" w:cs="Courier New" w:hint="default"/>
+      </w:rPr>
+    </w:lvl>
+    <w:lvl w:ilvl="2" w:tplc="08090005" w:tentative="1">
+      <w:start w:val="1"/>
+      <w:numFmt w:val="bullet"/>
+      <w:lvlText w:val=""/>
+      <w:lvlJc w:val="left"/>
+      <w:pPr>
+        <w:ind w:left="2160" w:hanging="360"/>
+      </w:pPr>
+      <w:rPr>
+        <w:rFonts w:ascii="Wingdings" w:hAnsi="Wingdings" w:hint="default"/>
+      </w:rPr>
+    </w:lvl>
+    <w:lvl w:ilvl="3" w:tplc="08090001" w:tentative="1">
+      <w:start w:val="1"/>
+      <w:numFmt w:val="bullet"/>
+      <w:lvlText w:val=""/>
+      <w:lvlJc w:val="left"/>
+      <w:pPr>
+        <w:ind w:left="2880" w:hanging="360"/>
+      </w:pPr>
+      <w:rPr>
+        <w:rFonts w:ascii="Symbol" w:hAnsi="Symbol" w:hint="default"/>
+      </w:rPr>
+    </w:lvl>
+    <w:lvl w:ilvl="4" w:tplc="08090003" w:tentative="1">
+      <w:start w:val="1"/>
+      <w:numFmt w:val="bullet"/>
+      <w:lvlText w:val="o"/>
+      <w:lvlJc w:val="left"/>
+      <w:pPr>
+        <w:ind w:left="3600" w:hanging="360"/>
+      </w:pPr>
+      <w:rPr>
+        <w:rFonts w:ascii="Courier New" w:hAnsi="Courier New" w:cs="Courier New" w:hint="default"/>
+      </w:rPr>
+    </w:lvl>
+    <w:lvl w:ilvl="5" w:tplc="08090005" w:tentative="1">
+      <w:start w:val="1"/>
+      <w:numFmt w:val="bullet"/>
+      <w:lvlText w:val=""/>
+      <w:lvlJc w:val="left"/>
+      <w:pPr>
+        <w:ind w:left="4320" w:hanging="360"/>
+      </w:pPr>
+      <w:rPr>
+        <w:rFonts w:ascii="Wingdings" w:hAnsi="Wingdings" w:hint="default"/>
+      </w:rPr>
+    </w:lvl>
+    <w:lvl w:ilvl="6" w:tplc="08090001" w:tentative="1">
+      <w:start w:val="1"/>
+      <w:numFmt w:val="bullet"/>
+      <w:lvlText w:val=""/>
+      <w:lvlJc w:val="left"/>
+      <w:pPr>
+        <w:ind w:left="5040" w:hanging="360"/>
+      </w:pPr>
+      <w:rPr>
+        <w:rFonts w:ascii="Symbol" w:hAnsi="Symbol" w:hint="default"/>
+      </w:rPr>
+    </w:lvl>
+    <w:lvl w:ilvl="7" w:tplc="08090003" w:tentative="1">
+      <w:start w:val="1"/>
+      <w:numFmt w:val="bullet"/>
+      <w:lvlText w:val="o"/>
+      <w:lvlJc w:val="left"/>
+      <w:pPr>
+        <w:ind w:left="5760" w:hanging="360"/>
+      </w:pPr>
+      <w:rPr>
+        <w:rFonts w:ascii="Courier New" w:hAnsi="Courier New" w:cs="Courier New" w:hint="default"/>
+      </w:rPr>
+    </w:lvl>
+    <w:lvl w:ilvl="8" w:tplc="08090005" w:tentative="1">
+      <w:start w:val="1"/>
+      <w:numFmt w:val="bullet"/>
+      <w:lvlText w:val=""/>
+      <w:lvlJc w:val="left"/>
+      <w:pPr>
+        <w:ind w:left="6480" w:hanging="360"/>
+      </w:pPr>
+      <w:rPr>
+        <w:rFonts w:ascii="Wingdings" w:hAnsi="Wingdings" w:hint="default"/>
+      </w:rPr>
+    </w:lvl>
+  </w:abstractNum>
+  <w:abstractNum w:abstractNumId="5" w15:restartNumberingAfterBreak="0">
+    <w:nsid w:val="23540525"/>
+    <w:multiLevelType w:val="hybridMultilevel"/>
+    <w:tmpl w:val="F860FF34"/>
+    <w:lvl w:ilvl="0" w:tplc="08090001">
+      <w:start w:val="1"/>
+      <w:numFmt w:val="bullet"/>
+      <w:lvlText w:val=""/>
+      <w:lvlJc w:val="left"/>
+      <w:pPr>
+        <w:ind w:left="720" w:hanging="360"/>
+      </w:pPr>
+      <w:rPr>
+        <w:rFonts w:ascii="Symbol" w:hAnsi="Symbol" w:hint="default"/>
+      </w:rPr>
+    </w:lvl>
+    <w:lvl w:ilvl="1" w:tplc="08090003" w:tentative="1">
+      <w:start w:val="1"/>
+      <w:numFmt w:val="bullet"/>
+      <w:lvlText w:val="o"/>
+      <w:lvlJc w:val="left"/>
+      <w:pPr>
+        <w:ind w:left="1440" w:hanging="360"/>
+      </w:pPr>
+      <w:rPr>
+        <w:rFonts w:ascii="Courier New" w:hAnsi="Courier New" w:cs="Courier New" w:hint="default"/>
+      </w:rPr>
+    </w:lvl>
+    <w:lvl w:ilvl="2" w:tplc="08090005" w:tentative="1">
+      <w:start w:val="1"/>
+      <w:numFmt w:val="bullet"/>
+      <w:lvlText w:val=""/>
+      <w:lvlJc w:val="left"/>
+      <w:pPr>
+        <w:ind w:left="2160" w:hanging="360"/>
+      </w:pPr>
+      <w:rPr>
+        <w:rFonts w:ascii="Wingdings" w:hAnsi="Wingdings" w:hint="default"/>
+      </w:rPr>
+    </w:lvl>
+    <w:lvl w:ilvl="3" w:tplc="08090001" w:tentative="1">
+      <w:start w:val="1"/>
+      <w:numFmt w:val="bullet"/>
+      <w:lvlText w:val=""/>
+      <w:lvlJc w:val="left"/>
+      <w:pPr>
+        <w:ind w:left="2880" w:hanging="360"/>
+      </w:pPr>
+      <w:rPr>
+        <w:rFonts w:ascii="Symbol" w:hAnsi="Symbol" w:hint="default"/>
+      </w:rPr>
+    </w:lvl>
+    <w:lvl w:ilvl="4" w:tplc="08090003" w:tentative="1">
+      <w:start w:val="1"/>
+      <w:numFmt w:val="bullet"/>
+      <w:lvlText w:val="o"/>
+      <w:lvlJc w:val="left"/>
+      <w:pPr>
+        <w:ind w:left="3600" w:hanging="360"/>
+      </w:pPr>
+      <w:rPr>
+        <w:rFonts w:ascii="Courier New" w:hAnsi="Courier New" w:cs="Courier New" w:hint="default"/>
+      </w:rPr>
+    </w:lvl>
+    <w:lvl w:ilvl="5" w:tplc="08090005" w:tentative="1">
+      <w:start w:val="1"/>
+      <w:numFmt w:val="bullet"/>
+      <w:lvlText w:val=""/>
+      <w:lvlJc w:val="left"/>
+      <w:pPr>
+        <w:ind w:left="4320" w:hanging="360"/>
+      </w:pPr>
+      <w:rPr>
+        <w:rFonts w:ascii="Wingdings" w:hAnsi="Wingdings" w:hint="default"/>
+      </w:rPr>
+    </w:lvl>
+    <w:lvl w:ilvl="6" w:tplc="08090001" w:tentative="1">
+      <w:start w:val="1"/>
+      <w:numFmt w:val="bullet"/>
+      <w:lvlText w:val=""/>
+      <w:lvlJc w:val="left"/>
+      <w:pPr>
+        <w:ind w:left="5040" w:hanging="360"/>
+      </w:pPr>
+      <w:rPr>
+        <w:rFonts w:ascii="Symbol" w:hAnsi="Symbol" w:hint="default"/>
+      </w:rPr>
+    </w:lvl>
+    <w:lvl w:ilvl="7" w:tplc="08090003" w:tentative="1">
+      <w:start w:val="1"/>
+      <w:numFmt w:val="bullet"/>
+      <w:lvlText w:val="o"/>
+      <w:lvlJc w:val="left"/>
+      <w:pPr>
+        <w:ind w:left="5760" w:hanging="360"/>
+      </w:pPr>
+      <w:rPr>
+        <w:rFonts w:ascii="Courier New" w:hAnsi="Courier New" w:cs="Courier New" w:hint="default"/>
+      </w:rPr>
+    </w:lvl>
+    <w:lvl w:ilvl="8" w:tplc="08090005" w:tentative="1">
+      <w:start w:val="1"/>
+      <w:numFmt w:val="bullet"/>
+      <w:lvlText w:val=""/>
+      <w:lvlJc w:val="left"/>
+      <w:pPr>
+        <w:ind w:left="6480" w:hanging="360"/>
+      </w:pPr>
+      <w:rPr>
+        <w:rFonts w:ascii="Wingdings" w:hAnsi="Wingdings" w:hint="default"/>
+      </w:rPr>
+    </w:lvl>
+  </w:abstractNum>
+  <w:abstractNum w:abstractNumId="6" w15:restartNumberingAfterBreak="0">
+    <w:nsid w:val="2FC009B1"/>
+    <w:multiLevelType w:val="hybridMultilevel"/>
+    <w:tmpl w:val="F1E43E5E"/>
+    <w:lvl w:ilvl="0" w:tplc="08090001">
+      <w:start w:val="1"/>
+      <w:numFmt w:val="bullet"/>
+      <w:lvlText w:val=""/>
+      <w:lvlJc w:val="left"/>
+      <w:pPr>
+        <w:ind w:left="720" w:hanging="360"/>
+      </w:pPr>
+      <w:rPr>
+        <w:rFonts w:ascii="Symbol" w:hAnsi="Symbol" w:hint="default"/>
+      </w:rPr>
+    </w:lvl>
+    <w:lvl w:ilvl="1" w:tplc="08090003" w:tentative="1">
+      <w:start w:val="1"/>
+      <w:numFmt w:val="bullet"/>
+      <w:lvlText w:val="o"/>
+      <w:lvlJc w:val="left"/>
+      <w:pPr>
+        <w:ind w:left="1440" w:hanging="360"/>
+      </w:pPr>
+      <w:rPr>
+        <w:rFonts w:ascii="Courier New" w:hAnsi="Courier New" w:cs="Courier New" w:hint="default"/>
+      </w:rPr>
+    </w:lvl>
+    <w:lvl w:ilvl="2" w:tplc="08090005" w:tentative="1">
+      <w:start w:val="1"/>
+      <w:numFmt w:val="bullet"/>
+      <w:lvlText w:val=""/>
+      <w:lvlJc w:val="left"/>
+      <w:pPr>
+        <w:ind w:left="2160" w:hanging="360"/>
+      </w:pPr>
+      <w:rPr>
+        <w:rFonts w:ascii="Wingdings" w:hAnsi="Wingdings" w:hint="default"/>
+      </w:rPr>
+    </w:lvl>
+    <w:lvl w:ilvl="3" w:tplc="08090001" w:tentative="1">
+      <w:start w:val="1"/>
+      <w:numFmt w:val="bullet"/>
+      <w:lvlText w:val=""/>
+      <w:lvlJc w:val="left"/>
+      <w:pPr>
+        <w:ind w:left="2880" w:hanging="360"/>
+      </w:pPr>
+      <w:rPr>
+        <w:rFonts w:ascii="Symbol" w:hAnsi="Symbol" w:hint="default"/>
+      </w:rPr>
+    </w:lvl>
+    <w:lvl w:ilvl="4" w:tplc="08090003" w:tentative="1">
+      <w:start w:val="1"/>
+      <w:numFmt w:val="bullet"/>
+      <w:lvlText w:val="o"/>
+      <w:lvlJc w:val="left"/>
+      <w:pPr>
+        <w:ind w:left="3600" w:hanging="360"/>
+      </w:pPr>
+      <w:rPr>
+        <w:rFonts w:ascii="Courier New" w:hAnsi="Courier New" w:cs="Courier New" w:hint="default"/>
+      </w:rPr>
+    </w:lvl>
+    <w:lvl w:ilvl="5" w:tplc="08090005" w:tentative="1">
+      <w:start w:val="1"/>
+      <w:numFmt w:val="bullet"/>
+      <w:lvlText w:val=""/>
+      <w:lvlJc w:val="left"/>
+      <w:pPr>
+        <w:ind w:left="4320" w:hanging="360"/>
+      </w:pPr>
+      <w:rPr>
+        <w:rFonts w:ascii="Wingdings" w:hAnsi="Wingdings" w:hint="default"/>
+      </w:rPr>
+    </w:lvl>
+    <w:lvl w:ilvl="6" w:tplc="08090001" w:tentative="1">
+      <w:start w:val="1"/>
+      <w:numFmt w:val="bullet"/>
+      <w:lvlText w:val=""/>
+      <w:lvlJc w:val="left"/>
+      <w:pPr>
+        <w:ind w:left="5040" w:hanging="360"/>
+      </w:pPr>
+      <w:rPr>
+        <w:rFonts w:ascii="Symbol" w:hAnsi="Symbol" w:hint="default"/>
+      </w:rPr>
+    </w:lvl>
+    <w:lvl w:ilvl="7" w:tplc="08090003" w:tentative="1">
+      <w:start w:val="1"/>
+      <w:numFmt w:val="bullet"/>
+      <w:lvlText w:val="o"/>
+      <w:lvlJc w:val="left"/>
+      <w:pPr>
+        <w:ind w:left="5760" w:hanging="360"/>
+      </w:pPr>
+      <w:rPr>
+        <w:rFonts w:ascii="Courier New" w:hAnsi="Courier New" w:cs="Courier New" w:hint="default"/>
+      </w:rPr>
+    </w:lvl>
+    <w:lvl w:ilvl="8" w:tplc="08090005" w:tentative="1">
+      <w:start w:val="1"/>
+      <w:numFmt w:val="bullet"/>
+      <w:lvlText w:val=""/>
+      <w:lvlJc w:val="left"/>
+      <w:pPr>
+        <w:ind w:left="6480" w:hanging="360"/>
+      </w:pPr>
+      <w:rPr>
+        <w:rFonts w:ascii="Wingdings" w:hAnsi="Wingdings" w:hint="default"/>
+      </w:rPr>
+    </w:lvl>
+  </w:abstractNum>
+  <w:abstractNum w:abstractNumId="7" w15:restartNumberingAfterBreak="0">
+    <w:nsid w:val="3E046377"/>
+    <w:multiLevelType w:val="hybridMultilevel"/>
+    <w:tmpl w:val="23082D7E"/>
+    <w:lvl w:ilvl="0" w:tplc="08090001">
+      <w:start w:val="1"/>
+      <w:numFmt w:val="bullet"/>
+      <w:lvlText w:val=""/>
+      <w:lvlJc w:val="left"/>
+      <w:pPr>
+        <w:ind w:left="720" w:hanging="360"/>
+      </w:pPr>
+      <w:rPr>
+        <w:rFonts w:ascii="Symbol" w:hAnsi="Symbol" w:hint="default"/>
+      </w:rPr>
+    </w:lvl>
+    <w:lvl w:ilvl="1" w:tplc="08090003" w:tentative="1">
+      <w:start w:val="1"/>
+      <w:numFmt w:val="bullet"/>
+      <w:lvlText w:val="o"/>
+      <w:lvlJc w:val="left"/>
+      <w:pPr>
+        <w:ind w:left="1440" w:hanging="360"/>
+      </w:pPr>
+      <w:rPr>
+        <w:rFonts w:ascii="Courier New" w:hAnsi="Courier New" w:cs="Courier New" w:hint="default"/>
+      </w:rPr>
+    </w:lvl>
+    <w:lvl w:ilvl="2" w:tplc="08090005" w:tentative="1">
+      <w:start w:val="1"/>
+      <w:numFmt w:val="bullet"/>
+      <w:lvlText w:val=""/>
+      <w:lvlJc w:val="left"/>
+      <w:pPr>
+        <w:ind w:left="2160" w:hanging="360"/>
+      </w:pPr>
+      <w:rPr>
+        <w:rFonts w:ascii="Wingdings" w:hAnsi="Wingdings" w:hint="default"/>
+      </w:rPr>
+    </w:lvl>
+    <w:lvl w:ilvl="3" w:tplc="08090001" w:tentative="1">
+      <w:start w:val="1"/>
+      <w:numFmt w:val="bullet"/>
+      <w:lvlText w:val=""/>
+      <w:lvlJc w:val="left"/>
+      <w:pPr>
+        <w:ind w:left="2880" w:hanging="360"/>
+      </w:pPr>
+      <w:rPr>
+        <w:rFonts w:ascii="Symbol" w:hAnsi="Symbol" w:hint="default"/>
+      </w:rPr>
+    </w:lvl>
+    <w:lvl w:ilvl="4" w:tplc="08090003" w:tentative="1">
+      <w:start w:val="1"/>
+      <w:numFmt w:val="bullet"/>
+      <w:lvlText w:val="o"/>
+      <w:lvlJc w:val="left"/>
+      <w:pPr>
+        <w:ind w:left="3600" w:hanging="360"/>
+      </w:pPr>
+      <w:rPr>
+        <w:rFonts w:ascii="Courier New" w:hAnsi="Courier New" w:cs="Courier New" w:hint="default"/>
+      </w:rPr>
+    </w:lvl>
+    <w:lvl w:ilvl="5" w:tplc="08090005" w:tentative="1">
+      <w:start w:val="1"/>
+      <w:numFmt w:val="bullet"/>
+      <w:lvlText w:val=""/>
+      <w:lvlJc w:val="left"/>
+      <w:pPr>
+        <w:ind w:left="4320" w:hanging="360"/>
+      </w:pPr>
+      <w:rPr>
+        <w:rFonts w:ascii="Wingdings" w:hAnsi="Wingdings" w:hint="default"/>
+      </w:rPr>
+    </w:lvl>
+    <w:lvl w:ilvl="6" w:tplc="08090001" w:tentative="1">
+      <w:start w:val="1"/>
+      <w:numFmt w:val="bullet"/>
+      <w:lvlText w:val=""/>
+      <w:lvlJc w:val="left"/>
+      <w:pPr>
+        <w:ind w:left="5040" w:hanging="360"/>
+      </w:pPr>
+      <w:rPr>
+        <w:rFonts w:ascii="Symbol" w:hAnsi="Symbol" w:hint="default"/>
+      </w:rPr>
+    </w:lvl>
+    <w:lvl w:ilvl="7" w:tplc="08090003" w:tentative="1">
+      <w:start w:val="1"/>
+      <w:numFmt w:val="bullet"/>
+      <w:lvlText w:val="o"/>
+      <w:lvlJc w:val="left"/>
+      <w:pPr>
+        <w:ind w:left="5760" w:hanging="360"/>
+      </w:pPr>
+      <w:rPr>
+        <w:rFonts w:ascii="Courier New" w:hAnsi="Courier New" w:cs="Courier New" w:hint="default"/>
+      </w:rPr>
+    </w:lvl>
+    <w:lvl w:ilvl="8" w:tplc="08090005" w:tentative="1">
+      <w:start w:val="1"/>
+      <w:numFmt w:val="bullet"/>
+      <w:lvlText w:val=""/>
+      <w:lvlJc w:val="left"/>
+      <w:pPr>
+        <w:ind w:left="6480" w:hanging="360"/>
+      </w:pPr>
+      <w:rPr>
+        <w:rFonts w:ascii="Wingdings" w:hAnsi="Wingdings" w:hint="default"/>
+      </w:rPr>
+    </w:lvl>
+  </w:abstractNum>
+  <w:abstractNum w:abstractNumId="8" w15:restartNumberingAfterBreak="0">
+    <w:nsid w:val="3E394C50"/>
+    <w:multiLevelType w:val="hybridMultilevel"/>
+    <w:tmpl w:val="D76E434C"/>
+    <w:lvl w:ilvl="0" w:tplc="08090001">
+      <w:start w:val="1"/>
+      <w:numFmt w:val="bullet"/>
+      <w:lvlText w:val=""/>
+      <w:lvlJc w:val="left"/>
+      <w:pPr>
+        <w:ind w:left="720" w:hanging="360"/>
+      </w:pPr>
+      <w:rPr>
+        <w:rFonts w:ascii="Symbol" w:hAnsi="Symbol" w:hint="default"/>
+      </w:rPr>
+    </w:lvl>
+    <w:lvl w:ilvl="1" w:tplc="08090003" w:tentative="1">
+      <w:start w:val="1"/>
+      <w:numFmt w:val="bullet"/>
+      <w:lvlText w:val="o"/>
+      <w:lvlJc w:val="left"/>
+      <w:pPr>
+        <w:ind w:left="1440" w:hanging="360"/>
+      </w:pPr>
+      <w:rPr>
+        <w:rFonts w:ascii="Courier New" w:hAnsi="Courier New" w:cs="Courier New" w:hint="default"/>
+      </w:rPr>
+    </w:lvl>
+    <w:lvl w:ilvl="2" w:tplc="08090005" w:tentative="1">
+      <w:start w:val="1"/>
+      <w:numFmt w:val="bullet"/>
+      <w:lvlText w:val=""/>
+      <w:lvlJc w:val="left"/>
+      <w:pPr>
+        <w:ind w:left="2160" w:hanging="360"/>
+      </w:pPr>
+      <w:rPr>
+        <w:rFonts w:ascii="Wingdings" w:hAnsi="Wingdings" w:hint="default"/>
+      </w:rPr>
+    </w:lvl>
+    <w:lvl w:ilvl="3" w:tplc="08090001" w:tentative="1">
+      <w:start w:val="1"/>
+      <w:numFmt w:val="bullet"/>
+      <w:lvlText w:val=""/>
+      <w:lvlJc w:val="left"/>
+      <w:pPr>
+        <w:ind w:left="2880" w:hanging="360"/>
+      </w:pPr>
+      <w:rPr>
+        <w:rFonts w:ascii="Symbol" w:hAnsi="Symbol" w:hint="default"/>
+      </w:rPr>
+    </w:lvl>
+    <w:lvl w:ilvl="4" w:tplc="08090003" w:tentative="1">
+      <w:start w:val="1"/>
+      <w:numFmt w:val="bullet"/>
+      <w:lvlText w:val="o"/>
+      <w:lvlJc w:val="left"/>
+      <w:pPr>
+        <w:ind w:left="3600" w:hanging="360"/>
+      </w:pPr>
+      <w:rPr>
+        <w:rFonts w:ascii="Courier New" w:hAnsi="Courier New" w:cs="Courier New" w:hint="default"/>
+      </w:rPr>
+    </w:lvl>
+    <w:lvl w:ilvl="5" w:tplc="08090005" w:tentative="1">
+      <w:start w:val="1"/>
+      <w:numFmt w:val="bullet"/>
+      <w:lvlText w:val=""/>
+      <w:lvlJc w:val="left"/>
+      <w:pPr>
+        <w:ind w:left="4320" w:hanging="360"/>
+      </w:pPr>
+      <w:rPr>
+        <w:rFonts w:ascii="Wingdings" w:hAnsi="Wingdings" w:hint="default"/>
+      </w:rPr>
+    </w:lvl>
+    <w:lvl w:ilvl="6" w:tplc="08090001" w:tentative="1">
+      <w:start w:val="1"/>
+      <w:numFmt w:val="bullet"/>
+      <w:lvlText w:val=""/>
+      <w:lvlJc w:val="left"/>
+      <w:pPr>
+        <w:ind w:left="5040" w:hanging="360"/>
+      </w:pPr>
+      <w:rPr>
+        <w:rFonts w:ascii="Symbol" w:hAnsi="Symbol" w:hint="default"/>
+      </w:rPr>
+    </w:lvl>
+    <w:lvl w:ilvl="7" w:tplc="08090003" w:tentative="1">
+      <w:start w:val="1"/>
+      <w:numFmt w:val="bullet"/>
+      <w:lvlText w:val="o"/>
+      <w:lvlJc w:val="left"/>
+      <w:pPr>
+        <w:ind w:left="5760" w:hanging="360"/>
+      </w:pPr>
+      <w:rPr>
+        <w:rFonts w:ascii="Courier New" w:hAnsi="Courier New" w:cs="Courier New" w:hint="default"/>
+      </w:rPr>
+    </w:lvl>
+    <w:lvl w:ilvl="8" w:tplc="08090005" w:tentative="1">
+      <w:start w:val="1"/>
+      <w:numFmt w:val="bullet"/>
+      <w:lvlText w:val=""/>
+      <w:lvlJc w:val="left"/>
+      <w:pPr>
+        <w:ind w:left="6480" w:hanging="360"/>
+      </w:pPr>
+      <w:rPr>
+        <w:rFonts w:ascii="Wingdings" w:hAnsi="Wingdings" w:hint="default"/>
+      </w:rPr>
+    </w:lvl>
+  </w:abstractNum>
+  <w:abstractNum w:abstractNumId="9" w15:restartNumberingAfterBreak="0">
     <w:nsid w:val="4A32146F"/>
     <w:multiLevelType w:val="hybridMultilevel"/>
     <w:tmpl w:val="11E61ACE"/>
@@ -673,10 +3193,10 @@
       </w:rPr>
     </w:lvl>
   </w:abstractNum>
-  <w:abstractNum w:abstractNumId="2" w15:restartNumberingAfterBreak="0">
+  <w:abstractNum w:abstractNumId="10" w15:restartNumberingAfterBreak="0">
     <w:nsid w:val="555C603E"/>
     <w:multiLevelType w:val="hybridMultilevel"/>
-    <w:tmpl w:val="C9565F02"/>
+    <w:tmpl w:val="F9B426B8"/>
     <w:lvl w:ilvl="0" w:tplc="08090001">
       <w:start w:val="1"/>
       <w:numFmt w:val="bullet"/>
@@ -786,7 +3306,7 @@
       </w:rPr>
     </w:lvl>
   </w:abstractNum>
-  <w:abstractNum w:abstractNumId="3" w15:restartNumberingAfterBreak="0">
+  <w:abstractNum w:abstractNumId="11" w15:restartNumberingAfterBreak="0">
     <w:nsid w:val="5C8770EA"/>
     <w:multiLevelType w:val="hybridMultilevel"/>
     <w:tmpl w:val="11DA1CD2"/>
@@ -899,7 +3419,7 @@
       </w:rPr>
     </w:lvl>
   </w:abstractNum>
-  <w:abstractNum w:abstractNumId="4" w15:restartNumberingAfterBreak="0">
+  <w:abstractNum w:abstractNumId="12" w15:restartNumberingAfterBreak="0">
     <w:nsid w:val="60A43C4E"/>
     <w:multiLevelType w:val="hybridMultilevel"/>
     <w:tmpl w:val="60C608FA"/>
@@ -1012,7 +3532,7 @@
       </w:rPr>
     </w:lvl>
   </w:abstractNum>
-  <w:abstractNum w:abstractNumId="5" w15:restartNumberingAfterBreak="0">
+  <w:abstractNum w:abstractNumId="13" w15:restartNumberingAfterBreak="0">
     <w:nsid w:val="68F12B4E"/>
     <w:multiLevelType w:val="hybridMultilevel"/>
     <w:tmpl w:val="2DD8460C"/>
@@ -1125,23 +3645,395 @@
       </w:rPr>
     </w:lvl>
   </w:abstractNum>
+  <w:abstractNum w:abstractNumId="14" w15:restartNumberingAfterBreak="0">
+    <w:nsid w:val="721847A1"/>
+    <w:multiLevelType w:val="hybridMultilevel"/>
+    <w:tmpl w:val="517C6C8E"/>
+    <w:lvl w:ilvl="0" w:tplc="08090001">
+      <w:start w:val="1"/>
+      <w:numFmt w:val="bullet"/>
+      <w:lvlText w:val=""/>
+      <w:lvlJc w:val="left"/>
+      <w:pPr>
+        <w:ind w:left="720" w:hanging="360"/>
+      </w:pPr>
+      <w:rPr>
+        <w:rFonts w:ascii="Symbol" w:hAnsi="Symbol" w:hint="default"/>
+      </w:rPr>
+    </w:lvl>
+    <w:lvl w:ilvl="1" w:tplc="08090003" w:tentative="1">
+      <w:start w:val="1"/>
+      <w:numFmt w:val="bullet"/>
+      <w:lvlText w:val="o"/>
+      <w:lvlJc w:val="left"/>
+      <w:pPr>
+        <w:ind w:left="1440" w:hanging="360"/>
+      </w:pPr>
+      <w:rPr>
+        <w:rFonts w:ascii="Courier New" w:hAnsi="Courier New" w:cs="Courier New" w:hint="default"/>
+      </w:rPr>
+    </w:lvl>
+    <w:lvl w:ilvl="2" w:tplc="08090005" w:tentative="1">
+      <w:start w:val="1"/>
+      <w:numFmt w:val="bullet"/>
+      <w:lvlText w:val=""/>
+      <w:lvlJc w:val="left"/>
+      <w:pPr>
+        <w:ind w:left="2160" w:hanging="360"/>
+      </w:pPr>
+      <w:rPr>
+        <w:rFonts w:ascii="Wingdings" w:hAnsi="Wingdings" w:hint="default"/>
+      </w:rPr>
+    </w:lvl>
+    <w:lvl w:ilvl="3" w:tplc="08090001" w:tentative="1">
+      <w:start w:val="1"/>
+      <w:numFmt w:val="bullet"/>
+      <w:lvlText w:val=""/>
+      <w:lvlJc w:val="left"/>
+      <w:pPr>
+        <w:ind w:left="2880" w:hanging="360"/>
+      </w:pPr>
+      <w:rPr>
+        <w:rFonts w:ascii="Symbol" w:hAnsi="Symbol" w:hint="default"/>
+      </w:rPr>
+    </w:lvl>
+    <w:lvl w:ilvl="4" w:tplc="08090003" w:tentative="1">
+      <w:start w:val="1"/>
+      <w:numFmt w:val="bullet"/>
+      <w:lvlText w:val="o"/>
+      <w:lvlJc w:val="left"/>
+      <w:pPr>
+        <w:ind w:left="3600" w:hanging="360"/>
+      </w:pPr>
+      <w:rPr>
+        <w:rFonts w:ascii="Courier New" w:hAnsi="Courier New" w:cs="Courier New" w:hint="default"/>
+      </w:rPr>
+    </w:lvl>
+    <w:lvl w:ilvl="5" w:tplc="08090005" w:tentative="1">
+      <w:start w:val="1"/>
+      <w:numFmt w:val="bullet"/>
+      <w:lvlText w:val=""/>
+      <w:lvlJc w:val="left"/>
+      <w:pPr>
+        <w:ind w:left="4320" w:hanging="360"/>
+      </w:pPr>
+      <w:rPr>
+        <w:rFonts w:ascii="Wingdings" w:hAnsi="Wingdings" w:hint="default"/>
+      </w:rPr>
+    </w:lvl>
+    <w:lvl w:ilvl="6" w:tplc="08090001" w:tentative="1">
+      <w:start w:val="1"/>
+      <w:numFmt w:val="bullet"/>
+      <w:lvlText w:val=""/>
+      <w:lvlJc w:val="left"/>
+      <w:pPr>
+        <w:ind w:left="5040" w:hanging="360"/>
+      </w:pPr>
+      <w:rPr>
+        <w:rFonts w:ascii="Symbol" w:hAnsi="Symbol" w:hint="default"/>
+      </w:rPr>
+    </w:lvl>
+    <w:lvl w:ilvl="7" w:tplc="08090003" w:tentative="1">
+      <w:start w:val="1"/>
+      <w:numFmt w:val="bullet"/>
+      <w:lvlText w:val="o"/>
+      <w:lvlJc w:val="left"/>
+      <w:pPr>
+        <w:ind w:left="5760" w:hanging="360"/>
+      </w:pPr>
+      <w:rPr>
+        <w:rFonts w:ascii="Courier New" w:hAnsi="Courier New" w:cs="Courier New" w:hint="default"/>
+      </w:rPr>
+    </w:lvl>
+    <w:lvl w:ilvl="8" w:tplc="08090005" w:tentative="1">
+      <w:start w:val="1"/>
+      <w:numFmt w:val="bullet"/>
+      <w:lvlText w:val=""/>
+      <w:lvlJc w:val="left"/>
+      <w:pPr>
+        <w:ind w:left="6480" w:hanging="360"/>
+      </w:pPr>
+      <w:rPr>
+        <w:rFonts w:ascii="Wingdings" w:hAnsi="Wingdings" w:hint="default"/>
+      </w:rPr>
+    </w:lvl>
+  </w:abstractNum>
+  <w:abstractNum w:abstractNumId="15" w15:restartNumberingAfterBreak="0">
+    <w:nsid w:val="75ED66FE"/>
+    <w:multiLevelType w:val="hybridMultilevel"/>
+    <w:tmpl w:val="D64005CE"/>
+    <w:lvl w:ilvl="0" w:tplc="08090001">
+      <w:start w:val="1"/>
+      <w:numFmt w:val="bullet"/>
+      <w:lvlText w:val=""/>
+      <w:lvlJc w:val="left"/>
+      <w:pPr>
+        <w:ind w:left="720" w:hanging="360"/>
+      </w:pPr>
+      <w:rPr>
+        <w:rFonts w:ascii="Symbol" w:hAnsi="Symbol" w:hint="default"/>
+      </w:rPr>
+    </w:lvl>
+    <w:lvl w:ilvl="1" w:tplc="08090003" w:tentative="1">
+      <w:start w:val="1"/>
+      <w:numFmt w:val="bullet"/>
+      <w:lvlText w:val="o"/>
+      <w:lvlJc w:val="left"/>
+      <w:pPr>
+        <w:ind w:left="1440" w:hanging="360"/>
+      </w:pPr>
+      <w:rPr>
+        <w:rFonts w:ascii="Courier New" w:hAnsi="Courier New" w:cs="Courier New" w:hint="default"/>
+      </w:rPr>
+    </w:lvl>
+    <w:lvl w:ilvl="2" w:tplc="08090005" w:tentative="1">
+      <w:start w:val="1"/>
+      <w:numFmt w:val="bullet"/>
+      <w:lvlText w:val=""/>
+      <w:lvlJc w:val="left"/>
+      <w:pPr>
+        <w:ind w:left="2160" w:hanging="360"/>
+      </w:pPr>
+      <w:rPr>
+        <w:rFonts w:ascii="Wingdings" w:hAnsi="Wingdings" w:hint="default"/>
+      </w:rPr>
+    </w:lvl>
+    <w:lvl w:ilvl="3" w:tplc="08090001" w:tentative="1">
+      <w:start w:val="1"/>
+      <w:numFmt w:val="bullet"/>
+      <w:lvlText w:val=""/>
+      <w:lvlJc w:val="left"/>
+      <w:pPr>
+        <w:ind w:left="2880" w:hanging="360"/>
+      </w:pPr>
+      <w:rPr>
+        <w:rFonts w:ascii="Symbol" w:hAnsi="Symbol" w:hint="default"/>
+      </w:rPr>
+    </w:lvl>
+    <w:lvl w:ilvl="4" w:tplc="08090003" w:tentative="1">
+      <w:start w:val="1"/>
+      <w:numFmt w:val="bullet"/>
+      <w:lvlText w:val="o"/>
+      <w:lvlJc w:val="left"/>
+      <w:pPr>
+        <w:ind w:left="3600" w:hanging="360"/>
+      </w:pPr>
+      <w:rPr>
+        <w:rFonts w:ascii="Courier New" w:hAnsi="Courier New" w:cs="Courier New" w:hint="default"/>
+      </w:rPr>
+    </w:lvl>
+    <w:lvl w:ilvl="5" w:tplc="08090005" w:tentative="1">
+      <w:start w:val="1"/>
+      <w:numFmt w:val="bullet"/>
+      <w:lvlText w:val=""/>
+      <w:lvlJc w:val="left"/>
+      <w:pPr>
+        <w:ind w:left="4320" w:hanging="360"/>
+      </w:pPr>
+      <w:rPr>
+        <w:rFonts w:ascii="Wingdings" w:hAnsi="Wingdings" w:hint="default"/>
+      </w:rPr>
+    </w:lvl>
+    <w:lvl w:ilvl="6" w:tplc="08090001" w:tentative="1">
+      <w:start w:val="1"/>
+      <w:numFmt w:val="bullet"/>
+      <w:lvlText w:val=""/>
+      <w:lvlJc w:val="left"/>
+      <w:pPr>
+        <w:ind w:left="5040" w:hanging="360"/>
+      </w:pPr>
+      <w:rPr>
+        <w:rFonts w:ascii="Symbol" w:hAnsi="Symbol" w:hint="default"/>
+      </w:rPr>
+    </w:lvl>
+    <w:lvl w:ilvl="7" w:tplc="08090003" w:tentative="1">
+      <w:start w:val="1"/>
+      <w:numFmt w:val="bullet"/>
+      <w:lvlText w:val="o"/>
+      <w:lvlJc w:val="left"/>
+      <w:pPr>
+        <w:ind w:left="5760" w:hanging="360"/>
+      </w:pPr>
+      <w:rPr>
+        <w:rFonts w:ascii="Courier New" w:hAnsi="Courier New" w:cs="Courier New" w:hint="default"/>
+      </w:rPr>
+    </w:lvl>
+    <w:lvl w:ilvl="8" w:tplc="08090005" w:tentative="1">
+      <w:start w:val="1"/>
+      <w:numFmt w:val="bullet"/>
+      <w:lvlText w:val=""/>
+      <w:lvlJc w:val="left"/>
+      <w:pPr>
+        <w:ind w:left="6480" w:hanging="360"/>
+      </w:pPr>
+      <w:rPr>
+        <w:rFonts w:ascii="Wingdings" w:hAnsi="Wingdings" w:hint="default"/>
+      </w:rPr>
+    </w:lvl>
+  </w:abstractNum>
+  <w:abstractNum w:abstractNumId="16" w15:restartNumberingAfterBreak="0">
+    <w:nsid w:val="7FC860EF"/>
+    <w:multiLevelType w:val="hybridMultilevel"/>
+    <w:tmpl w:val="04AA260A"/>
+    <w:lvl w:ilvl="0" w:tplc="08090001">
+      <w:start w:val="1"/>
+      <w:numFmt w:val="bullet"/>
+      <w:lvlText w:val=""/>
+      <w:lvlJc w:val="left"/>
+      <w:pPr>
+        <w:ind w:left="720" w:hanging="360"/>
+      </w:pPr>
+      <w:rPr>
+        <w:rFonts w:ascii="Symbol" w:hAnsi="Symbol" w:hint="default"/>
+      </w:rPr>
+    </w:lvl>
+    <w:lvl w:ilvl="1" w:tplc="08090003" w:tentative="1">
+      <w:start w:val="1"/>
+      <w:numFmt w:val="bullet"/>
+      <w:lvlText w:val="o"/>
+      <w:lvlJc w:val="left"/>
+      <w:pPr>
+        <w:ind w:left="1440" w:hanging="360"/>
+      </w:pPr>
+      <w:rPr>
+        <w:rFonts w:ascii="Courier New" w:hAnsi="Courier New" w:cs="Courier New" w:hint="default"/>
+      </w:rPr>
+    </w:lvl>
+    <w:lvl w:ilvl="2" w:tplc="08090005" w:tentative="1">
+      <w:start w:val="1"/>
+      <w:numFmt w:val="bullet"/>
+      <w:lvlText w:val=""/>
+      <w:lvlJc w:val="left"/>
+      <w:pPr>
+        <w:ind w:left="2160" w:hanging="360"/>
+      </w:pPr>
+      <w:rPr>
+        <w:rFonts w:ascii="Wingdings" w:hAnsi="Wingdings" w:hint="default"/>
+      </w:rPr>
+    </w:lvl>
+    <w:lvl w:ilvl="3" w:tplc="08090001" w:tentative="1">
+      <w:start w:val="1"/>
+      <w:numFmt w:val="bullet"/>
+      <w:lvlText w:val=""/>
+      <w:lvlJc w:val="left"/>
+      <w:pPr>
+        <w:ind w:left="2880" w:hanging="360"/>
+      </w:pPr>
+      <w:rPr>
+        <w:rFonts w:ascii="Symbol" w:hAnsi="Symbol" w:hint="default"/>
+      </w:rPr>
+    </w:lvl>
+    <w:lvl w:ilvl="4" w:tplc="08090003" w:tentative="1">
+      <w:start w:val="1"/>
+      <w:numFmt w:val="bullet"/>
+      <w:lvlText w:val="o"/>
+      <w:lvlJc w:val="left"/>
+      <w:pPr>
+        <w:ind w:left="3600" w:hanging="360"/>
+      </w:pPr>
+      <w:rPr>
+        <w:rFonts w:ascii="Courier New" w:hAnsi="Courier New" w:cs="Courier New" w:hint="default"/>
+      </w:rPr>
+    </w:lvl>
+    <w:lvl w:ilvl="5" w:tplc="08090005" w:tentative="1">
+      <w:start w:val="1"/>
+      <w:numFmt w:val="bullet"/>
+      <w:lvlText w:val=""/>
+      <w:lvlJc w:val="left"/>
+      <w:pPr>
+        <w:ind w:left="4320" w:hanging="360"/>
+      </w:pPr>
+      <w:rPr>
+        <w:rFonts w:ascii="Wingdings" w:hAnsi="Wingdings" w:hint="default"/>
+      </w:rPr>
+    </w:lvl>
+    <w:lvl w:ilvl="6" w:tplc="08090001" w:tentative="1">
+      <w:start w:val="1"/>
+      <w:numFmt w:val="bullet"/>
+      <w:lvlText w:val=""/>
+      <w:lvlJc w:val="left"/>
+      <w:pPr>
+        <w:ind w:left="5040" w:hanging="360"/>
+      </w:pPr>
+      <w:rPr>
+        <w:rFonts w:ascii="Symbol" w:hAnsi="Symbol" w:hint="default"/>
+      </w:rPr>
+    </w:lvl>
+    <w:lvl w:ilvl="7" w:tplc="08090003" w:tentative="1">
+      <w:start w:val="1"/>
+      <w:numFmt w:val="bullet"/>
+      <w:lvlText w:val="o"/>
+      <w:lvlJc w:val="left"/>
+      <w:pPr>
+        <w:ind w:left="5760" w:hanging="360"/>
+      </w:pPr>
+      <w:rPr>
+        <w:rFonts w:ascii="Courier New" w:hAnsi="Courier New" w:cs="Courier New" w:hint="default"/>
+      </w:rPr>
+    </w:lvl>
+    <w:lvl w:ilvl="8" w:tplc="08090005" w:tentative="1">
+      <w:start w:val="1"/>
+      <w:numFmt w:val="bullet"/>
+      <w:lvlText w:val=""/>
+      <w:lvlJc w:val="left"/>
+      <w:pPr>
+        <w:ind w:left="6480" w:hanging="360"/>
+      </w:pPr>
+      <w:rPr>
+        <w:rFonts w:ascii="Wingdings" w:hAnsi="Wingdings" w:hint="default"/>
+      </w:rPr>
+    </w:lvl>
+  </w:abstractNum>
   <w:num w:numId="1" w16cid:durableId="1406219813">
+    <w:abstractNumId w:val="10"/>
+  </w:num>
+  <w:num w:numId="2" w16cid:durableId="987442492">
+    <w:abstractNumId w:val="3"/>
+  </w:num>
+  <w:num w:numId="3" w16cid:durableId="1090585040">
+    <w:abstractNumId w:val="9"/>
+  </w:num>
+  <w:num w:numId="4" w16cid:durableId="1326279349">
+    <w:abstractNumId w:val="12"/>
+  </w:num>
+  <w:num w:numId="5" w16cid:durableId="13846945">
+    <w:abstractNumId w:val="11"/>
+  </w:num>
+  <w:num w:numId="6" w16cid:durableId="1313874251">
+    <w:abstractNumId w:val="13"/>
+  </w:num>
+  <w:num w:numId="7" w16cid:durableId="478696674">
+    <w:abstractNumId w:val="4"/>
+  </w:num>
+  <w:num w:numId="8" w16cid:durableId="1126463249">
+    <w:abstractNumId w:val="1"/>
+  </w:num>
+  <w:num w:numId="9" w16cid:durableId="2146584633">
+    <w:abstractNumId w:val="0"/>
+  </w:num>
+  <w:num w:numId="10" w16cid:durableId="309216975">
+    <w:abstractNumId w:val="8"/>
+  </w:num>
+  <w:num w:numId="11" w16cid:durableId="502673443">
+    <w:abstractNumId w:val="15"/>
+  </w:num>
+  <w:num w:numId="12" w16cid:durableId="1737119025">
+    <w:abstractNumId w:val="16"/>
+  </w:num>
+  <w:num w:numId="13" w16cid:durableId="471142724">
     <w:abstractNumId w:val="2"/>
   </w:num>
-  <w:num w:numId="2" w16cid:durableId="987442492">
-    <w:abstractNumId w:val="0"/>
+  <w:num w:numId="14" w16cid:durableId="458380497">
+    <w:abstractNumId w:val="5"/>
   </w:num>
-  <w:num w:numId="3" w16cid:durableId="1090585040">
-    <w:abstractNumId w:val="1"/>
+  <w:num w:numId="15" w16cid:durableId="905797560">
+    <w:abstractNumId w:val="14"/>
   </w:num>
-  <w:num w:numId="4" w16cid:durableId="1326279349">
-    <w:abstractNumId w:val="4"/>
+  <w:num w:numId="16" w16cid:durableId="600770077">
+    <w:abstractNumId w:val="7"/>
   </w:num>
-  <w:num w:numId="5" w16cid:durableId="13846945">
-    <w:abstractNumId w:val="3"/>
-  </w:num>
-  <w:num w:numId="6" w16cid:durableId="1313874251">
-    <w:abstractNumId w:val="5"/>
+  <w:num w:numId="17" w16cid:durableId="1459494928">
+    <w:abstractNumId w:val="6"/>
   </w:num>
 </w:numbering>
 </file>
@@ -2081,6 +4973,25 @@
     <w:semiHidden/>
     <w:rsid w:val="00253ABE"/>
   </w:style>
+  <w:style w:type="table" w:styleId="TableGrid">
+    <w:name w:val="Table Grid"/>
+    <w:basedOn w:val="TableNormal"/>
+    <w:uiPriority w:val="39"/>
+    <w:rsid w:val="002D4D3E"/>
+    <w:pPr>
+      <w:spacing w:after="0" w:line="240" w:lineRule="auto"/>
+    </w:pPr>
+    <w:tblPr>
+      <w:tblBorders>
+        <w:top w:val="single" w:sz="4" w:space="0" w:color="auto"/>
+        <w:left w:val="single" w:sz="4" w:space="0" w:color="auto"/>
+        <w:bottom w:val="single" w:sz="4" w:space="0" w:color="auto"/>
+        <w:right w:val="single" w:sz="4" w:space="0" w:color="auto"/>
+        <w:insideH w:val="single" w:sz="4" w:space="0" w:color="auto"/>
+        <w:insideV w:val="single" w:sz="4" w:space="0" w:color="auto"/>
+      </w:tblBorders>
+    </w:tblPr>
+  </w:style>
 </w:styles>
 </file>
 
@@ -2380,6 +5291,15 @@
 </file>
 
 <file path=customXml/item1.xml><?xml version="1.0" encoding="utf-8"?>
+<?mso-contentType ?>
+<FormTemplates xmlns="http://schemas.microsoft.com/sharepoint/v3/contenttype/forms">
+  <Display>DocumentLibraryForm</Display>
+  <Edit>DocumentLibraryForm</Edit>
+  <New>DocumentLibraryForm</New>
+</FormTemplates>
+</file>
+
+<file path=customXml/item2.xml><?xml version="1.0" encoding="utf-8"?>
 <ct:contentTypeSchema xmlns:ct="http://schemas.microsoft.com/office/2006/metadata/contentType" xmlns:ma="http://schemas.microsoft.com/office/2006/metadata/properties/metaAttributes" ct:_="" ma:_="" ma:contentTypeName="Document" ma:contentTypeID="0x0101001BE5375FF31C3E40A471EB786507D009" ma:contentTypeVersion="11" ma:contentTypeDescription="Create a new document." ma:contentTypeScope="" ma:versionID="42a79d177e073060118b3f26c9f45197">
   <xsd:schema xmlns:xsd="http://www.w3.org/2001/XMLSchema" xmlns:xs="http://www.w3.org/2001/XMLSchema" xmlns:p="http://schemas.microsoft.com/office/2006/metadata/properties" xmlns:ns3="7cd080e9-c5cf-4d99-bc08-2a3e85ed19f2" targetNamespace="http://schemas.microsoft.com/office/2006/metadata/properties" ma:root="true" ma:fieldsID="49e7f8ba73eb6f244726330dfda763a1" ns3:_="">
     <xsd:import namespace="7cd080e9-c5cf-4d99-bc08-2a3e85ed19f2"/>
@@ -2567,15 +5487,6 @@
 </ct:contentTypeSchema>
 </file>
 
-<file path=customXml/item2.xml><?xml version="1.0" encoding="utf-8"?>
-<?mso-contentType ?>
-<FormTemplates xmlns="http://schemas.microsoft.com/sharepoint/v3/contenttype/forms">
-  <Display>DocumentLibraryForm</Display>
-  <Edit>DocumentLibraryForm</Edit>
-  <New>DocumentLibraryForm</New>
-</FormTemplates>
-</file>
-
 <file path=customXml/item3.xml><?xml version="1.0" encoding="utf-8"?>
 <p:properties xmlns:p="http://schemas.microsoft.com/office/2006/metadata/properties" xmlns:xsi="http://www.w3.org/2001/XMLSchema-instance" xmlns:pc="http://schemas.microsoft.com/office/infopath/2007/PartnerControls">
   <documentManagement>
@@ -2585,6 +5496,14 @@
 </file>
 
 <file path=customXml/itemProps1.xml><?xml version="1.0" encoding="utf-8"?>
+<ds:datastoreItem xmlns:ds="http://schemas.openxmlformats.org/officeDocument/2006/customXml" ds:itemID="{73F29C20-B9D5-4F52-96A6-94B9FF10F71E}">
+  <ds:schemaRefs>
+    <ds:schemaRef ds:uri="http://schemas.microsoft.com/sharepoint/v3/contenttype/forms"/>
+  </ds:schemaRefs>
+</ds:datastoreItem>
+</file>
+
+<file path=customXml/itemProps2.xml><?xml version="1.0" encoding="utf-8"?>
 <ds:datastoreItem xmlns:ds="http://schemas.openxmlformats.org/officeDocument/2006/customXml" ds:itemID="{2D2F8EE4-5CF8-45C8-B30E-433364BE7004}">
   <ds:schemaRefs>
     <ds:schemaRef ds:uri="http://schemas.microsoft.com/office/2006/metadata/contentType"/>
@@ -2598,14 +5517,6 @@
     <ds:schemaRef ds:uri="http://purl.org/dc/elements/1.1/"/>
     <ds:schemaRef ds:uri="http://purl.org/dc/terms/"/>
     <ds:schemaRef ds:uri="http://schemas.microsoft.com/internal/obd"/>
-  </ds:schemaRefs>
-</ds:datastoreItem>
-</file>
-
-<file path=customXml/itemProps2.xml><?xml version="1.0" encoding="utf-8"?>
-<ds:datastoreItem xmlns:ds="http://schemas.openxmlformats.org/officeDocument/2006/customXml" ds:itemID="{73F29C20-B9D5-4F52-96A6-94B9FF10F71E}">
-  <ds:schemaRefs>
-    <ds:schemaRef ds:uri="http://schemas.microsoft.com/sharepoint/v3/contenttype/forms"/>
   </ds:schemaRefs>
 </ds:datastoreItem>
 </file>

</xml_diff>

<commit_message>
Added Meeting Minutes File
</commit_message>
<xml_diff>
--- a/Scrum Meeting Dump/Scrum Meeting Minutes.docx
+++ b/Scrum Meeting Dump/Scrum Meeting Minutes.docx
@@ -922,13 +922,7 @@
         </w:numPr>
       </w:pPr>
       <w:r>
-        <w:t>Ed Bick</w:t>
-      </w:r>
-      <w:r>
-        <w:t>le</w:t>
-      </w:r>
-      <w:r>
-        <w:t>y</w:t>
+        <w:t>Ed Bickley</w:t>
       </w:r>
     </w:p>
     <w:p>
@@ -1873,12 +1867,22 @@
           <w:u w:val="single"/>
         </w:rPr>
       </w:pPr>
-      <w:r>
-        <w:rPr>
-          <w:b/>
-          <w:bCs/>
-          <w:u w:val="single"/>
-        </w:rPr>
+    </w:p>
+    <w:p>
+      <w:pPr>
+        <w:rPr>
+          <w:b/>
+          <w:bCs/>
+          <w:u w:val="single"/>
+        </w:rPr>
+      </w:pPr>
+      <w:r>
+        <w:rPr>
+          <w:b/>
+          <w:bCs/>
+          <w:u w:val="single"/>
+        </w:rPr>
+        <w:lastRenderedPageBreak/>
         <w:t>16/02/2026</w:t>
       </w:r>
       <w:r>
@@ -1892,7 +1896,6 @@
     </w:p>
     <w:p>
       <w:r>
-        <w:lastRenderedPageBreak/>
         <w:t>10:00 – 12:00</w:t>
       </w:r>
       <w:r>
@@ -5291,15 +5294,6 @@
 </file>
 
 <file path=customXml/item1.xml><?xml version="1.0" encoding="utf-8"?>
-<?mso-contentType ?>
-<FormTemplates xmlns="http://schemas.microsoft.com/sharepoint/v3/contenttype/forms">
-  <Display>DocumentLibraryForm</Display>
-  <Edit>DocumentLibraryForm</Edit>
-  <New>DocumentLibraryForm</New>
-</FormTemplates>
-</file>
-
-<file path=customXml/item2.xml><?xml version="1.0" encoding="utf-8"?>
 <ct:contentTypeSchema xmlns:ct="http://schemas.microsoft.com/office/2006/metadata/contentType" xmlns:ma="http://schemas.microsoft.com/office/2006/metadata/properties/metaAttributes" ct:_="" ma:_="" ma:contentTypeName="Document" ma:contentTypeID="0x0101001BE5375FF31C3E40A471EB786507D009" ma:contentTypeVersion="11" ma:contentTypeDescription="Create a new document." ma:contentTypeScope="" ma:versionID="42a79d177e073060118b3f26c9f45197">
   <xsd:schema xmlns:xsd="http://www.w3.org/2001/XMLSchema" xmlns:xs="http://www.w3.org/2001/XMLSchema" xmlns:p="http://schemas.microsoft.com/office/2006/metadata/properties" xmlns:ns3="7cd080e9-c5cf-4d99-bc08-2a3e85ed19f2" targetNamespace="http://schemas.microsoft.com/office/2006/metadata/properties" ma:root="true" ma:fieldsID="49e7f8ba73eb6f244726330dfda763a1" ns3:_="">
     <xsd:import namespace="7cd080e9-c5cf-4d99-bc08-2a3e85ed19f2"/>
@@ -5487,6 +5481,15 @@
 </ct:contentTypeSchema>
 </file>
 
+<file path=customXml/item2.xml><?xml version="1.0" encoding="utf-8"?>
+<?mso-contentType ?>
+<FormTemplates xmlns="http://schemas.microsoft.com/sharepoint/v3/contenttype/forms">
+  <Display>DocumentLibraryForm</Display>
+  <Edit>DocumentLibraryForm</Edit>
+  <New>DocumentLibraryForm</New>
+</FormTemplates>
+</file>
+
 <file path=customXml/item3.xml><?xml version="1.0" encoding="utf-8"?>
 <p:properties xmlns:p="http://schemas.microsoft.com/office/2006/metadata/properties" xmlns:xsi="http://www.w3.org/2001/XMLSchema-instance" xmlns:pc="http://schemas.microsoft.com/office/infopath/2007/PartnerControls">
   <documentManagement>
@@ -5496,14 +5499,6 @@
 </file>
 
 <file path=customXml/itemProps1.xml><?xml version="1.0" encoding="utf-8"?>
-<ds:datastoreItem xmlns:ds="http://schemas.openxmlformats.org/officeDocument/2006/customXml" ds:itemID="{73F29C20-B9D5-4F52-96A6-94B9FF10F71E}">
-  <ds:schemaRefs>
-    <ds:schemaRef ds:uri="http://schemas.microsoft.com/sharepoint/v3/contenttype/forms"/>
-  </ds:schemaRefs>
-</ds:datastoreItem>
-</file>
-
-<file path=customXml/itemProps2.xml><?xml version="1.0" encoding="utf-8"?>
 <ds:datastoreItem xmlns:ds="http://schemas.openxmlformats.org/officeDocument/2006/customXml" ds:itemID="{2D2F8EE4-5CF8-45C8-B30E-433364BE7004}">
   <ds:schemaRefs>
     <ds:schemaRef ds:uri="http://schemas.microsoft.com/office/2006/metadata/contentType"/>
@@ -5517,6 +5512,14 @@
     <ds:schemaRef ds:uri="http://purl.org/dc/elements/1.1/"/>
     <ds:schemaRef ds:uri="http://purl.org/dc/terms/"/>
     <ds:schemaRef ds:uri="http://schemas.microsoft.com/internal/obd"/>
+  </ds:schemaRefs>
+</ds:datastoreItem>
+</file>
+
+<file path=customXml/itemProps2.xml><?xml version="1.0" encoding="utf-8"?>
+<ds:datastoreItem xmlns:ds="http://schemas.openxmlformats.org/officeDocument/2006/customXml" ds:itemID="{73F29C20-B9D5-4F52-96A6-94B9FF10F71E}">
+  <ds:schemaRefs>
+    <ds:schemaRef ds:uri="http://schemas.microsoft.com/sharepoint/v3/contenttype/forms"/>
   </ds:schemaRefs>
 </ds:datastoreItem>
 </file>

</xml_diff>